<commit_message>
feat: Implement autosave functionality for efetivo and atividades steps in the wizard
</commit_message>
<xml_diff>
--- a/documentos/resources/plano_trabalho.docx
+++ b/documentos/resources/plano_trabalho.docx
@@ -33,24 +33,87 @@
         <w:spacing w:lineRule="auto" w:line="240" w:before="147" w:after="0"/>
         <w:jc w:val="center"/>
         <w:rPr>
-          <w:rFonts w:ascii="Liberation Serif" w:hAnsi="Liberation Serif"/>
+          <w:b/>
+          <w:bCs/>
+          <w:color w:val="000009"/>
+          <w:sz w:val="40"/>
+          <w:szCs w:val="40"/>
+        </w:rPr>
+      </w:pPr>
+      <w:r>
+        <w:rPr>
+          <w:b/>
+          <w:bCs/>
+          <w:color w:val="000009"/>
+          <w:sz w:val="40"/>
+          <w:szCs w:val="40"/>
+        </w:rPr>
+      </w:r>
+    </w:p>
+    <w:p>
+      <w:pPr>
+        <w:pStyle w:val="Normal"/>
+        <w:widowControl w:val="false"/>
+        <w:spacing w:lineRule="auto" w:line="240" w:before="147" w:after="0"/>
+        <w:jc w:val="center"/>
+        <w:rPr>
+          <w:b/>
+          <w:bCs/>
+          <w:color w:val="000009"/>
+          <w:sz w:val="40"/>
+          <w:szCs w:val="40"/>
+        </w:rPr>
+      </w:pPr>
+      <w:r>
+        <w:rPr>
+          <w:b/>
+          <w:bCs/>
+          <w:color w:val="000009"/>
+          <w:sz w:val="40"/>
+          <w:szCs w:val="40"/>
+        </w:rPr>
+      </w:r>
+    </w:p>
+    <w:p>
+      <w:pPr>
+        <w:pStyle w:val="Normal"/>
+        <w:widowControl w:val="false"/>
+        <w:spacing w:lineRule="auto" w:line="240" w:before="147" w:after="0"/>
+        <w:jc w:val="center"/>
+        <w:rPr>
+          <w:rFonts w:ascii="Arial" w:hAnsi="Arial"/>
+        </w:rPr>
+      </w:pPr>
+      <w:r>
+        <w:rPr>
           <w:b/>
           <w:bCs/>
           <w:color w:val="000009"/>
           <w:sz w:val="30"/>
           <w:szCs w:val="30"/>
         </w:rPr>
-      </w:pPr>
-      <w:r>
-        <w:rPr>
-          <w:rFonts w:ascii="Liberation Serif" w:hAnsi="Liberation Serif"/>
+        <w:t>PLANO DE TRABALHO Nº{{numero_plano_trabalho}}</w:t>
+      </w:r>
+    </w:p>
+    <w:p>
+      <w:pPr>
+        <w:pStyle w:val="Normal"/>
+        <w:widowControl w:val="false"/>
+        <w:spacing w:lineRule="auto" w:line="240" w:before="147" w:after="0"/>
+        <w:jc w:val="center"/>
+        <w:rPr>
+          <w:rFonts w:ascii="Arial" w:hAnsi="Arial"/>
+        </w:rPr>
+      </w:pPr>
+      <w:r>
+        <w:rPr>
           <w:b/>
           <w:bCs/>
           <w:color w:val="000009"/>
           <w:sz w:val="30"/>
           <w:szCs w:val="30"/>
         </w:rPr>
-        <w:t>PLANO DE TRABALHO Nº{{numero_plano_trabalho}}</w:t>
+        <w:t>{{unidade}}</w:t>
       </w:r>
     </w:p>
     <w:p>
@@ -60,23 +123,11 @@
         <w:spacing w:lineRule="auto" w:line="240" w:before="147" w:after="0"/>
         <w:jc w:val="center"/>
         <w:rPr>
-          <w:rFonts w:ascii="Liberation Serif" w:hAnsi="Liberation Serif"/>
-        </w:rPr>
-      </w:pPr>
-      <w:r>
-        <w:rPr>
-          <w:rFonts w:ascii="Liberation Serif" w:hAnsi="Liberation Serif"/>
-          <w:b/>
-          <w:bCs/>
-          <w:color w:val="000009"/>
-          <w:sz w:val="30"/>
-          <w:szCs w:val="30"/>
-        </w:rPr>
-        <w:t>{{unidade}}</w:t>
-      </w:r>
+          <w:rFonts w:ascii="Arial" w:hAnsi="Arial"/>
+        </w:rPr>
+      </w:pPr>
       <w:r>
         <w:rPr/>
-        <w:br/>
       </w:r>
     </w:p>
     <w:p>
@@ -86,13 +137,53 @@
         <w:spacing w:lineRule="auto" w:line="240" w:before="147" w:after="0"/>
         <w:jc w:val="center"/>
         <w:rPr>
-          <w:rFonts w:ascii="Liberation Serif" w:hAnsi="Liberation Serif"/>
-        </w:rPr>
-      </w:pPr>
-      <w:r>
-        <w:rPr>
-          <w:rFonts w:ascii="Liberation Serif" w:hAnsi="Liberation Serif"/>
-        </w:rPr>
+          <w:rFonts w:ascii="Arial" w:hAnsi="Arial"/>
+        </w:rPr>
+      </w:pPr>
+      <w:r>
+        <w:rPr/>
+      </w:r>
+    </w:p>
+    <w:p>
+      <w:pPr>
+        <w:pStyle w:val="Normal"/>
+        <w:widowControl w:val="false"/>
+        <w:spacing w:lineRule="auto" w:line="240" w:before="147" w:after="0"/>
+        <w:jc w:val="center"/>
+        <w:rPr>
+          <w:rFonts w:ascii="Arial" w:hAnsi="Arial"/>
+        </w:rPr>
+      </w:pPr>
+      <w:r>
+        <w:rPr/>
+      </w:r>
+    </w:p>
+    <w:p>
+      <w:pPr>
+        <w:pStyle w:val="Normal"/>
+        <w:widowControl w:val="false"/>
+        <w:spacing w:lineRule="auto" w:line="240" w:before="147" w:after="0"/>
+        <w:jc w:val="center"/>
+        <w:rPr>
+          <w:rFonts w:ascii="Arial" w:hAnsi="Arial"/>
+        </w:rPr>
+      </w:pPr>
+      <w:r>
+        <w:rPr/>
+      </w:r>
+    </w:p>
+    <w:p>
+      <w:pPr>
+        <w:pStyle w:val="Normal"/>
+        <w:widowControl w:val="false"/>
+        <w:spacing w:lineRule="auto" w:line="240" w:before="147" w:after="0"/>
+        <w:jc w:val="center"/>
+        <w:rPr>
+          <w:rFonts w:ascii="Arial" w:hAnsi="Arial"/>
+        </w:rPr>
+      </w:pPr>
+      <w:r>
+        <w:rPr/>
       </w:r>
     </w:p>
     <w:p>
@@ -105,26 +196,63 @@
           <w:ilvl w:val="0"/>
           <w:numId w:val="1"/>
         </w:numPr>
+        <w:tabs>
+          <w:tab w:val="clear" w:pos="720"/>
+          <w:tab w:val="left" w:pos="168" w:leader="none"/>
+          <w:tab w:val="left" w:pos="288" w:leader="none"/>
+        </w:tabs>
+        <w:suppressAutoHyphens w:val="true"/>
         <w:bidi w:val="0"/>
         <w:spacing w:lineRule="auto" w:line="240" w:before="261" w:after="114"/>
         <w:ind w:hanging="0" w:start="0" w:end="0"/>
-        <w:rPr>
-          <w:rFonts w:ascii="Liberation Serif" w:hAnsi="Liberation Serif"/>
+        <w:jc w:val="start"/>
+        <w:rPr>
+          <w:rFonts w:ascii="Arial" w:hAnsi="Arial"/>
+        </w:rPr>
+      </w:pPr>
+      <w:r>
+        <w:rPr>
           <w:b/>
           <w:bCs/>
           <w:sz w:val="24"/>
           <w:szCs w:val="24"/>
         </w:rPr>
-      </w:pPr>
-      <w:r>
-        <w:rPr>
-          <w:rFonts w:ascii="Liberation Serif" w:hAnsi="Liberation Serif"/>
-          <w:b/>
-          <w:bCs/>
-          <w:sz w:val="24"/>
-          <w:szCs w:val="24"/>
-        </w:rPr>
         <w:t>BREVE CONTEXTUALIZAÇÃO</w:t>
+      </w:r>
+    </w:p>
+    <w:p>
+      <w:pPr>
+        <w:pStyle w:val="Normal"/>
+        <w:widowControl w:val="false"/>
+        <w:numPr>
+          <w:ilvl w:val="0"/>
+          <w:numId w:val="0"/>
+        </w:numPr>
+        <w:tabs>
+          <w:tab w:val="clear" w:pos="720"/>
+          <w:tab w:val="left" w:pos="168" w:leader="none"/>
+          <w:tab w:val="left" w:pos="288" w:leader="none"/>
+        </w:tabs>
+        <w:suppressAutoHyphens w:val="true"/>
+        <w:bidi w:val="0"/>
+        <w:spacing w:lineRule="auto" w:line="240" w:before="261" w:after="114"/>
+        <w:ind w:hanging="0" w:start="0" w:end="0"/>
+        <w:jc w:val="start"/>
+        <w:rPr>
+          <w:rFonts w:ascii="Arial" w:hAnsi="Arial"/>
+          <w:b/>
+          <w:bCs/>
+          <w:sz w:val="12"/>
+          <w:szCs w:val="12"/>
+        </w:rPr>
+      </w:pPr>
+      <w:r>
+        <w:rPr>
+          <w:b/>
+          <w:bCs/>
+          <w:sz w:val="12"/>
+          <w:szCs w:val="12"/>
+        </w:rPr>
       </w:r>
     </w:p>
     <w:p>
@@ -137,16 +265,11 @@
         <w:spacing w:lineRule="auto" w:line="240" w:before="90" w:after="0"/>
         <w:ind w:hanging="0" w:start="0" w:end="0"/>
         <w:rPr>
-          <w:rFonts w:ascii="Liberation Serif" w:hAnsi="Liberation Serif"/>
-          <w:b w:val="false"/>
-          <w:bCs w:val="false"/>
-          <w:sz w:val="20"/>
-          <w:szCs w:val="20"/>
-        </w:rPr>
-      </w:pPr>
-      <w:r>
-        <w:rPr>
-          <w:rFonts w:ascii="Liberation Serif" w:hAnsi="Liberation Serif"/>
+          <w:rFonts w:ascii="Arial" w:hAnsi="Arial"/>
+        </w:rPr>
+      </w:pPr>
+      <w:r>
+        <w:rPr>
           <w:b w:val="false"/>
           <w:bCs w:val="false"/>
           <w:sz w:val="20"/>
@@ -168,7 +291,7 @@
         <w:ind w:hanging="0" w:start="0" w:end="0"/>
         <w:jc w:val="start"/>
         <w:rPr>
-          <w:rFonts w:ascii="Liberation Serif" w:hAnsi="Liberation Serif"/>
+          <w:rFonts w:ascii="Arial" w:hAnsi="Arial"/>
           <w:b/>
           <w:bCs/>
           <w:sz w:val="24"/>
@@ -177,7 +300,6 @@
       </w:pPr>
       <w:r>
         <w:rPr>
-          <w:rFonts w:ascii="Liberation Serif" w:hAnsi="Liberation Serif"/>
           <w:b/>
           <w:bCs/>
           <w:sz w:val="24"/>
@@ -195,47 +317,80 @@
           <w:ilvl w:val="0"/>
           <w:numId w:val="1"/>
         </w:numPr>
+        <w:tabs>
+          <w:tab w:val="clear" w:pos="720"/>
+          <w:tab w:val="left" w:pos="168" w:leader="none"/>
+          <w:tab w:val="left" w:pos="288" w:leader="none"/>
+        </w:tabs>
+        <w:spacing w:lineRule="auto" w:line="240" w:before="261" w:after="114"/>
+        <w:ind w:hanging="0" w:start="0" w:end="0"/>
+        <w:rPr>
+          <w:rFonts w:ascii="Arial" w:hAnsi="Arial"/>
+          <w:b/>
+          <w:bCs/>
+          <w:sz w:val="24"/>
+          <w:szCs w:val="24"/>
+        </w:rPr>
+      </w:pPr>
+      <w:r>
+        <w:rPr>
+          <w:b/>
+          <w:bCs/>
+          <w:sz w:val="24"/>
+          <w:szCs w:val="24"/>
+        </w:rPr>
+        <w:t>METAS ESTABELECIDAS</w:t>
+      </w:r>
+    </w:p>
+    <w:p>
+      <w:pPr>
+        <w:pStyle w:val="Normal"/>
+        <w:widowControl w:val="false"/>
+        <w:numPr>
+          <w:ilvl w:val="0"/>
+          <w:numId w:val="0"/>
+        </w:numPr>
+        <w:tabs>
+          <w:tab w:val="clear" w:pos="720"/>
+          <w:tab w:val="left" w:pos="168" w:leader="none"/>
+          <w:tab w:val="left" w:pos="288" w:leader="none"/>
+        </w:tabs>
+        <w:spacing w:lineRule="auto" w:line="240" w:before="261" w:after="114"/>
+        <w:ind w:hanging="0" w:start="0" w:end="0"/>
+        <w:rPr>
+          <w:rFonts w:ascii="Arial" w:hAnsi="Arial"/>
+          <w:b/>
+          <w:bCs/>
+          <w:sz w:val="12"/>
+          <w:szCs w:val="12"/>
+        </w:rPr>
+      </w:pPr>
+      <w:r>
+        <w:rPr>
+          <w:b/>
+          <w:bCs/>
+          <w:sz w:val="12"/>
+          <w:szCs w:val="12"/>
+        </w:rPr>
+      </w:r>
+    </w:p>
+    <w:p>
+      <w:pPr>
+        <w:pStyle w:val="Normal"/>
+        <w:keepNext w:val="true"/>
+        <w:keepLines/>
+        <w:widowControl w:val="false"/>
+        <w:suppressAutoHyphens w:val="true"/>
+        <w:bidi w:val="0"/>
         <w:spacing w:lineRule="auto" w:line="240" w:before="147" w:after="0"/>
         <w:ind w:hanging="0" w:start="0" w:end="0"/>
-        <w:rPr>
-          <w:rFonts w:ascii="Liberation Serif" w:hAnsi="Liberation Serif"/>
-          <w:b/>
-          <w:bCs/>
-          <w:sz w:val="24"/>
-          <w:szCs w:val="24"/>
-        </w:rPr>
-      </w:pPr>
-      <w:r>
-        <w:rPr>
-          <w:rFonts w:ascii="Liberation Serif" w:hAnsi="Liberation Serif"/>
-          <w:b/>
-          <w:bCs/>
-          <w:sz w:val="24"/>
-          <w:szCs w:val="24"/>
-        </w:rPr>
-        <w:t>METAS ESTABELECIDAS</w:t>
-      </w:r>
-    </w:p>
-    <w:p>
-      <w:pPr>
-        <w:pStyle w:val="Normal"/>
-        <w:keepNext w:val="true"/>
-        <w:keepLines/>
-        <w:widowControl w:val="false"/>
-        <w:bidi w:val="0"/>
-        <w:spacing w:lineRule="auto" w:line="240" w:before="147" w:after="0"/>
-        <w:ind w:hanging="0" w:start="737" w:end="0"/>
-        <w:rPr>
-          <w:rFonts w:ascii="Liberation Serif" w:hAnsi="Liberation Serif"/>
-          <w:b w:val="false"/>
-          <w:bCs w:val="false"/>
-          <w:sz w:val="20"/>
-          <w:szCs w:val="20"/>
-        </w:rPr>
-      </w:pPr>
-      <w:r>
-        <w:rPr>
-          <w:rFonts w:ascii="Liberation Serif" w:hAnsi="Liberation Serif"/>
+        <w:jc w:val="start"/>
+        <w:rPr>
+          <w:rFonts w:ascii="Arial" w:hAnsi="Arial"/>
+        </w:rPr>
+      </w:pPr>
+      <w:r>
+        <w:rPr>
           <w:b w:val="false"/>
           <w:bCs w:val="false"/>
           <w:sz w:val="20"/>
@@ -255,7 +410,7 @@
         <w:spacing w:lineRule="auto" w:line="240" w:before="147" w:after="0"/>
         <w:ind w:hanging="0" w:start="0" w:end="0"/>
         <w:rPr>
-          <w:rFonts w:ascii="Liberation Serif" w:hAnsi="Liberation Serif"/>
+          <w:rFonts w:ascii="Arial" w:hAnsi="Arial"/>
           <w:b/>
           <w:bCs/>
           <w:sz w:val="24"/>
@@ -264,7 +419,6 @@
       </w:pPr>
       <w:r>
         <w:rPr>
-          <w:rFonts w:ascii="Liberation Serif" w:hAnsi="Liberation Serif"/>
           <w:b/>
           <w:bCs/>
           <w:sz w:val="24"/>
@@ -282,77 +436,175 @@
           <w:ilvl w:val="0"/>
           <w:numId w:val="1"/>
         </w:numPr>
+        <w:tabs>
+          <w:tab w:val="clear" w:pos="720"/>
+          <w:tab w:val="left" w:pos="168" w:leader="none"/>
+          <w:tab w:val="left" w:pos="288" w:leader="none"/>
+        </w:tabs>
+        <w:spacing w:lineRule="auto" w:line="240" w:before="261" w:after="114"/>
+        <w:ind w:hanging="0" w:start="0" w:end="0"/>
+        <w:rPr>
+          <w:rFonts w:ascii="Arial" w:hAnsi="Arial"/>
+          <w:b/>
+          <w:bCs/>
+          <w:sz w:val="24"/>
+          <w:szCs w:val="24"/>
+        </w:rPr>
+      </w:pPr>
+      <w:r>
+        <w:rPr>
+          <w:b/>
+          <w:bCs/>
+          <w:sz w:val="24"/>
+          <w:szCs w:val="24"/>
+        </w:rPr>
+        <w:t>ATIVIDADES A SEREM DESENVOLVIDAS</w:t>
+      </w:r>
+    </w:p>
+    <w:p>
+      <w:pPr>
+        <w:pStyle w:val="Normal"/>
+        <w:widowControl w:val="false"/>
+        <w:numPr>
+          <w:ilvl w:val="0"/>
+          <w:numId w:val="0"/>
+        </w:numPr>
+        <w:tabs>
+          <w:tab w:val="clear" w:pos="720"/>
+          <w:tab w:val="left" w:pos="168" w:leader="none"/>
+          <w:tab w:val="left" w:pos="288" w:leader="none"/>
+        </w:tabs>
+        <w:spacing w:lineRule="auto" w:line="240" w:before="261" w:after="114"/>
+        <w:ind w:hanging="0" w:start="0" w:end="0"/>
+        <w:rPr>
+          <w:rFonts w:ascii="Arial" w:hAnsi="Arial"/>
+          <w:b/>
+          <w:bCs/>
+          <w:sz w:val="12"/>
+          <w:szCs w:val="12"/>
+        </w:rPr>
+      </w:pPr>
+      <w:r>
+        <w:rPr>
+          <w:b/>
+          <w:bCs/>
+          <w:sz w:val="12"/>
+          <w:szCs w:val="12"/>
+        </w:rPr>
+      </w:r>
+    </w:p>
+    <w:p>
+      <w:pPr>
+        <w:pStyle w:val="Normal"/>
+        <w:keepNext w:val="true"/>
+        <w:keepLines/>
+        <w:widowControl w:val="false"/>
+        <w:suppressAutoHyphens w:val="true"/>
+        <w:bidi w:val="0"/>
         <w:spacing w:lineRule="auto" w:line="240" w:before="147" w:after="0"/>
         <w:ind w:hanging="0" w:start="0" w:end="0"/>
-        <w:rPr>
-          <w:rFonts w:ascii="Liberation Serif" w:hAnsi="Liberation Serif"/>
-          <w:b/>
-          <w:bCs/>
-          <w:sz w:val="24"/>
-          <w:szCs w:val="24"/>
-        </w:rPr>
-      </w:pPr>
-      <w:r>
-        <w:rPr>
-          <w:rFonts w:ascii="Liberation Serif" w:hAnsi="Liberation Serif"/>
-          <w:b/>
-          <w:bCs/>
-          <w:sz w:val="24"/>
-          <w:szCs w:val="24"/>
-        </w:rPr>
-        <w:t>ATIVIDADES A SEREM DESENVOLVIDAS</w:t>
-      </w:r>
-    </w:p>
-    <w:p>
-      <w:pPr>
-        <w:pStyle w:val="Normal"/>
-        <w:keepNext w:val="true"/>
-        <w:keepLines/>
-        <w:widowControl w:val="false"/>
-        <w:bidi w:val="0"/>
-        <w:spacing w:lineRule="auto" w:line="240" w:before="147" w:after="0"/>
-        <w:ind w:hanging="0" w:start="737" w:end="0"/>
-        <w:rPr>
-          <w:rFonts w:ascii="Liberation Serif" w:hAnsi="Liberation Serif"/>
+        <w:jc w:val="start"/>
+        <w:rPr>
+          <w:rFonts w:ascii="Arial" w:hAnsi="Arial"/>
+        </w:rPr>
+      </w:pPr>
+      <w:r>
+        <w:rPr>
           <w:b w:val="false"/>
           <w:bCs w:val="false"/>
           <w:sz w:val="20"/>
           <w:szCs w:val="20"/>
         </w:rPr>
-      </w:pPr>
-      <w:r>
-        <w:rPr>
-          <w:rFonts w:ascii="Liberation Serif" w:hAnsi="Liberation Serif"/>
+        <w:t>{{atividades}}</w:t>
+      </w:r>
+    </w:p>
+    <w:p>
+      <w:pPr>
+        <w:pStyle w:val="Normal"/>
+        <w:widowControl w:val="false"/>
+        <w:spacing w:lineRule="auto" w:line="240" w:before="147" w:after="0"/>
+        <w:ind w:hanging="0" w:start="0" w:end="0"/>
+        <w:rPr>
+          <w:rFonts w:ascii="Arial" w:hAnsi="Arial"/>
+          <w:b/>
+          <w:bCs/>
+          <w:sz w:val="24"/>
+          <w:szCs w:val="24"/>
+        </w:rPr>
+      </w:pPr>
+      <w:r>
+        <w:rPr>
+          <w:b/>
+          <w:bCs/>
+          <w:sz w:val="24"/>
+          <w:szCs w:val="24"/>
+        </w:rPr>
+      </w:r>
+    </w:p>
+    <w:p>
+      <w:pPr>
+        <w:pStyle w:val="Normal"/>
+        <w:keepNext w:val="true"/>
+        <w:keepLines/>
+        <w:widowControl w:val="false"/>
+        <w:numPr>
+          <w:ilvl w:val="0"/>
+          <w:numId w:val="1"/>
+        </w:numPr>
+        <w:tabs>
+          <w:tab w:val="clear" w:pos="720"/>
+          <w:tab w:val="left" w:pos="168" w:leader="none"/>
+          <w:tab w:val="left" w:pos="288" w:leader="none"/>
+        </w:tabs>
+        <w:spacing w:lineRule="auto" w:line="240" w:before="261" w:after="114"/>
+        <w:ind w:hanging="0" w:start="0" w:end="0"/>
+        <w:rPr>
+          <w:rFonts w:ascii="Arial" w:hAnsi="Arial"/>
+          <w:b/>
+          <w:bCs/>
+          <w:sz w:val="24"/>
+          <w:szCs w:val="24"/>
+        </w:rPr>
+      </w:pPr>
+      <w:r>
+        <w:rPr>
+          <w:b/>
+          <w:bCs/>
+          <w:sz w:val="24"/>
+          <w:szCs w:val="24"/>
+        </w:rPr>
+        <w:t>ATUAÇÃO</w:t>
+      </w:r>
+    </w:p>
+    <w:p>
+      <w:pPr>
+        <w:pStyle w:val="Normal"/>
+        <w:keepNext w:val="true"/>
+        <w:keepLines/>
+        <w:widowControl w:val="false"/>
+        <w:spacing w:lineRule="auto" w:line="240" w:before="147" w:after="0"/>
+        <w:ind w:hanging="0" w:start="720" w:end="0"/>
+        <w:rPr>
+          <w:rFonts w:ascii="Arial" w:hAnsi="Arial"/>
+        </w:rPr>
+      </w:pPr>
+      <w:r>
+        <w:rPr>
+          <w:b/>
+          <w:bCs/>
+          <w:sz w:val="20"/>
+          <w:szCs w:val="20"/>
+        </w:rPr>
+        <w:t>Datas:</w:t>
+      </w:r>
+      <w:r>
+        <w:rPr>
           <w:b w:val="false"/>
           <w:bCs w:val="false"/>
           <w:sz w:val="20"/>
           <w:szCs w:val="20"/>
         </w:rPr>
-        <w:t>{{atividades}}</w:t>
-      </w:r>
-    </w:p>
-    <w:p>
-      <w:pPr>
-        <w:pStyle w:val="Normal"/>
-        <w:widowControl w:val="false"/>
-        <w:spacing w:lineRule="auto" w:line="240" w:before="147" w:after="0"/>
-        <w:ind w:hanging="0" w:start="0" w:end="0"/>
-        <w:rPr>
-          <w:rFonts w:ascii="Liberation Serif" w:hAnsi="Liberation Serif"/>
-          <w:b/>
-          <w:bCs/>
-          <w:sz w:val="24"/>
-          <w:szCs w:val="24"/>
-        </w:rPr>
-      </w:pPr>
-      <w:r>
-        <w:rPr>
-          <w:rFonts w:ascii="Liberation Serif" w:hAnsi="Liberation Serif"/>
-          <w:b/>
-          <w:bCs/>
-          <w:sz w:val="24"/>
-          <w:szCs w:val="24"/>
-        </w:rPr>
+        <w:t xml:space="preserve"> {{data_evento}}; </w:t>
       </w:r>
     </w:p>
     <w:p>
@@ -361,60 +613,60 @@
         <w:keepNext w:val="true"/>
         <w:keepLines/>
         <w:widowControl w:val="false"/>
-        <w:numPr>
-          <w:ilvl w:val="0"/>
-          <w:numId w:val="1"/>
-        </w:numPr>
-        <w:spacing w:lineRule="auto" w:line="240" w:before="147" w:after="0"/>
-        <w:ind w:hanging="0" w:start="0" w:end="0"/>
-        <w:rPr/>
-      </w:pPr>
-      <w:r>
-        <w:rPr>
-          <w:rFonts w:ascii="Liberation Serif" w:hAnsi="Liberation Serif"/>
-          <w:b/>
-          <w:bCs/>
-          <w:sz w:val="24"/>
-          <w:szCs w:val="24"/>
-        </w:rPr>
-        <w:t>ATUAÇÃO</w:t>
-      </w:r>
-    </w:p>
-    <w:p>
-      <w:pPr>
-        <w:pStyle w:val="Normal"/>
-        <w:keepNext w:val="true"/>
-        <w:keepLines/>
-        <w:widowControl w:val="false"/>
         <w:spacing w:lineRule="auto" w:line="240" w:before="147" w:after="0"/>
         <w:ind w:hanging="0" w:start="720" w:end="0"/>
         <w:rPr>
-          <w:rFonts w:ascii="Liberation Serif" w:hAnsi="Liberation Serif"/>
+          <w:rFonts w:ascii="Arial" w:hAnsi="Arial"/>
+        </w:rPr>
+      </w:pPr>
+      <w:r>
+        <w:rPr>
+          <w:b/>
+          <w:bCs/>
+          <w:sz w:val="20"/>
+          <w:szCs w:val="20"/>
+        </w:rPr>
+        <w:t>Local:</w:t>
+      </w:r>
+      <w:r>
+        <w:rPr>
           <w:b w:val="false"/>
           <w:bCs w:val="false"/>
           <w:sz w:val="20"/>
           <w:szCs w:val="20"/>
         </w:rPr>
-      </w:pPr>
-      <w:r>
-        <w:rPr>
-          <w:rFonts w:ascii="Liberation Serif" w:hAnsi="Liberation Serif"/>
+        <w:t xml:space="preserve"> {{destinos}}; </w:t>
+      </w:r>
+    </w:p>
+    <w:p>
+      <w:pPr>
+        <w:pStyle w:val="Normal"/>
+        <w:keepNext w:val="true"/>
+        <w:keepLines/>
+        <w:widowControl w:val="false"/>
+        <w:spacing w:lineRule="auto" w:line="240" w:before="147" w:after="0"/>
+        <w:ind w:hanging="0" w:start="720" w:end="0"/>
+        <w:rPr>
+          <w:rFonts w:ascii="Arial" w:hAnsi="Arial"/>
+        </w:rPr>
+      </w:pPr>
+      <w:r>
+        <w:rPr>
           <w:b/>
           <w:bCs/>
           <w:sz w:val="20"/>
           <w:szCs w:val="20"/>
         </w:rPr>
-        <w:t>Datas:</w:t>
-      </w:r>
-      <w:r>
-        <w:rPr>
-          <w:rFonts w:ascii="Liberation Serif" w:hAnsi="Liberation Serif"/>
+        <w:t>Horário de atendimento:</w:t>
+      </w:r>
+      <w:r>
+        <w:rPr>
           <w:b w:val="false"/>
           <w:bCs w:val="false"/>
           <w:sz w:val="20"/>
           <w:szCs w:val="20"/>
         </w:rPr>
-        <w:t xml:space="preserve"> {{data_evento}}; </w:t>
+        <w:t xml:space="preserve"> {{horario_de_atendimento}};</w:t>
       </w:r>
     </w:p>
     <w:p>
@@ -426,32 +678,26 @@
         <w:spacing w:lineRule="auto" w:line="240" w:before="147" w:after="0"/>
         <w:ind w:hanging="0" w:start="720" w:end="0"/>
         <w:rPr>
-          <w:rFonts w:ascii="Liberation Serif" w:hAnsi="Liberation Serif"/>
+          <w:rFonts w:ascii="Arial" w:hAnsi="Arial"/>
+        </w:rPr>
+      </w:pPr>
+      <w:r>
+        <w:rPr>
+          <w:b/>
+          <w:bCs/>
+          <w:sz w:val="20"/>
+          <w:szCs w:val="20"/>
+        </w:rPr>
+        <w:t>Efetivo total:</w:t>
+      </w:r>
+      <w:r>
+        <w:rPr>
           <w:b w:val="false"/>
           <w:bCs w:val="false"/>
           <w:sz w:val="20"/>
           <w:szCs w:val="20"/>
         </w:rPr>
-      </w:pPr>
-      <w:r>
-        <w:rPr>
-          <w:rFonts w:ascii="Liberation Serif" w:hAnsi="Liberation Serif"/>
-          <w:b/>
-          <w:bCs/>
-          <w:sz w:val="20"/>
-          <w:szCs w:val="20"/>
-        </w:rPr>
-        <w:t>Local:</w:t>
-      </w:r>
-      <w:r>
-        <w:rPr>
-          <w:rFonts w:ascii="Liberation Serif" w:hAnsi="Liberation Serif"/>
-          <w:b w:val="false"/>
-          <w:bCs w:val="false"/>
-          <w:sz w:val="20"/>
-          <w:szCs w:val="20"/>
-        </w:rPr>
-        <w:t xml:space="preserve"> {{destinos}}; </w:t>
+        <w:t xml:space="preserve"> {{efetivos}}; </w:t>
       </w:r>
     </w:p>
     <w:p>
@@ -461,92 +707,13 @@
         <w:keepLines/>
         <w:widowControl w:val="false"/>
         <w:spacing w:lineRule="auto" w:line="240" w:before="147" w:after="0"/>
-        <w:ind w:hanging="0" w:start="720" w:end="0"/>
-        <w:rPr>
-          <w:rFonts w:ascii="Liberation Serif" w:hAnsi="Liberation Serif"/>
-          <w:b/>
-          <w:bCs/>
-          <w:sz w:val="20"/>
-          <w:szCs w:val="20"/>
-        </w:rPr>
-      </w:pPr>
-      <w:r>
-        <w:rPr>
-          <w:rFonts w:ascii="Liberation Serif" w:hAnsi="Liberation Serif"/>
-          <w:b/>
-          <w:bCs/>
-          <w:sz w:val="20"/>
-          <w:szCs w:val="20"/>
-        </w:rPr>
-        <w:t>Horário de atendimento:</w:t>
-      </w:r>
-      <w:r>
-        <w:rPr>
-          <w:rFonts w:ascii="Liberation Serif" w:hAnsi="Liberation Serif"/>
-          <w:b w:val="false"/>
-          <w:bCs w:val="false"/>
-          <w:sz w:val="20"/>
-          <w:szCs w:val="20"/>
-        </w:rPr>
-        <w:t xml:space="preserve"> {{horario_de_atendimento}};</w:t>
-      </w:r>
-    </w:p>
-    <w:p>
-      <w:pPr>
-        <w:pStyle w:val="Normal"/>
-        <w:keepNext w:val="true"/>
-        <w:keepLines/>
-        <w:widowControl w:val="false"/>
-        <w:spacing w:lineRule="auto" w:line="240" w:before="147" w:after="0"/>
-        <w:ind w:hanging="0" w:start="720" w:end="0"/>
-        <w:rPr>
-          <w:rFonts w:ascii="Liberation Serif" w:hAnsi="Liberation Serif"/>
-          <w:b w:val="false"/>
-          <w:bCs w:val="false"/>
-          <w:sz w:val="20"/>
-          <w:szCs w:val="20"/>
-        </w:rPr>
-      </w:pPr>
-      <w:r>
-        <w:rPr>
-          <w:rFonts w:ascii="Liberation Serif" w:hAnsi="Liberation Serif"/>
-          <w:b/>
-          <w:bCs/>
-          <w:sz w:val="20"/>
-          <w:szCs w:val="20"/>
-        </w:rPr>
-        <w:t>Efetivo total:</w:t>
-      </w:r>
-      <w:r>
-        <w:rPr>
-          <w:rFonts w:ascii="Liberation Serif" w:hAnsi="Liberation Serif"/>
-          <w:b w:val="false"/>
-          <w:bCs w:val="false"/>
-          <w:sz w:val="20"/>
-          <w:szCs w:val="20"/>
-        </w:rPr>
-        <w:t xml:space="preserve"> {{efetivos}}; </w:t>
-      </w:r>
-    </w:p>
-    <w:p>
-      <w:pPr>
-        <w:pStyle w:val="Normal"/>
-        <w:keepNext w:val="true"/>
-        <w:keepLines/>
-        <w:widowControl w:val="false"/>
-        <w:spacing w:lineRule="auto" w:line="240" w:before="147" w:after="0"/>
         <w:ind w:hanging="0" w:start="720"/>
         <w:rPr>
-          <w:rFonts w:ascii="Liberation Serif" w:hAnsi="Liberation Serif"/>
-          <w:b w:val="false"/>
-          <w:bCs w:val="false"/>
-          <w:sz w:val="20"/>
-          <w:szCs w:val="20"/>
-        </w:rPr>
-      </w:pPr>
-      <w:r>
-        <w:rPr>
-          <w:rFonts w:ascii="Liberation Serif" w:hAnsi="Liberation Serif"/>
+          <w:rFonts w:ascii="Arial" w:hAnsi="Arial"/>
+        </w:rPr>
+      </w:pPr>
+      <w:r>
+        <w:rPr>
           <w:b w:val="false"/>
           <w:bCs w:val="false"/>
           <w:sz w:val="20"/>
@@ -566,7 +733,7 @@
         <w:spacing w:lineRule="auto" w:line="240" w:before="147" w:after="0"/>
         <w:ind w:hanging="0" w:start="0" w:end="0"/>
         <w:rPr>
-          <w:rFonts w:ascii="Liberation Serif" w:hAnsi="Liberation Serif"/>
+          <w:rFonts w:ascii="Arial" w:hAnsi="Arial"/>
           <w:b/>
           <w:bCs/>
           <w:sz w:val="24"/>
@@ -575,7 +742,6 @@
       </w:pPr>
       <w:r>
         <w:rPr>
-          <w:rFonts w:ascii="Liberation Serif" w:hAnsi="Liberation Serif"/>
           <w:b/>
           <w:bCs/>
           <w:sz w:val="24"/>
@@ -593,10 +759,15 @@
           <w:ilvl w:val="0"/>
           <w:numId w:val="1"/>
         </w:numPr>
-        <w:spacing w:lineRule="auto" w:line="240" w:before="147" w:after="0"/>
+        <w:tabs>
+          <w:tab w:val="clear" w:pos="720"/>
+          <w:tab w:val="left" w:pos="168" w:leader="none"/>
+          <w:tab w:val="left" w:pos="288" w:leader="none"/>
+        </w:tabs>
+        <w:spacing w:lineRule="auto" w:line="240" w:before="261" w:after="114"/>
         <w:ind w:hanging="0" w:start="0" w:end="0"/>
         <w:rPr>
-          <w:rFonts w:ascii="Liberation Serif" w:hAnsi="Liberation Serif"/>
+          <w:rFonts w:ascii="Arial" w:hAnsi="Arial"/>
           <w:b/>
           <w:bCs/>
           <w:sz w:val="24"/>
@@ -605,13 +776,44 @@
       </w:pPr>
       <w:r>
         <w:rPr>
-          <w:rFonts w:ascii="Liberation Serif" w:hAnsi="Liberation Serif"/>
           <w:b/>
           <w:bCs/>
           <w:sz w:val="24"/>
           <w:szCs w:val="24"/>
         </w:rPr>
         <w:t>VALOR TOTAL DO PLANO</w:t>
+      </w:r>
+    </w:p>
+    <w:p>
+      <w:pPr>
+        <w:pStyle w:val="Normal"/>
+        <w:widowControl w:val="false"/>
+        <w:numPr>
+          <w:ilvl w:val="0"/>
+          <w:numId w:val="0"/>
+        </w:numPr>
+        <w:tabs>
+          <w:tab w:val="clear" w:pos="720"/>
+          <w:tab w:val="left" w:pos="168" w:leader="none"/>
+          <w:tab w:val="left" w:pos="288" w:leader="none"/>
+        </w:tabs>
+        <w:spacing w:lineRule="auto" w:line="240" w:before="261" w:after="114"/>
+        <w:ind w:hanging="0" w:start="0" w:end="0"/>
+        <w:rPr>
+          <w:rFonts w:ascii="Arial" w:hAnsi="Arial"/>
+          <w:b/>
+          <w:bCs/>
+          <w:sz w:val="12"/>
+          <w:szCs w:val="12"/>
+        </w:rPr>
+      </w:pPr>
+      <w:r>
+        <w:rPr>
+          <w:b/>
+          <w:bCs/>
+          <w:sz w:val="12"/>
+          <w:szCs w:val="12"/>
+        </w:rPr>
       </w:r>
     </w:p>
     <w:p>
@@ -626,16 +828,11 @@
         <w:ind w:start="0" w:end="0"/>
         <w:jc w:val="start"/>
         <w:rPr>
-          <w:rFonts w:ascii="Liberation Serif" w:hAnsi="Liberation Serif"/>
-          <w:b w:val="false"/>
-          <w:bCs w:val="false"/>
-          <w:sz w:val="20"/>
-          <w:szCs w:val="20"/>
-        </w:rPr>
-      </w:pPr>
-      <w:r>
-        <w:rPr>
-          <w:rFonts w:ascii="Liberation Serif" w:hAnsi="Liberation Serif"/>
+          <w:rFonts w:ascii="Arial" w:hAnsi="Arial"/>
+        </w:rPr>
+      </w:pPr>
+      <w:r>
+        <w:rPr>
           <w:b w:val="false"/>
           <w:bCs w:val="false"/>
           <w:sz w:val="20"/>
@@ -654,7 +851,7 @@
         <w:ind w:start="0" w:end="0"/>
         <w:jc w:val="start"/>
         <w:rPr>
-          <w:rFonts w:ascii="Liberation Serif" w:hAnsi="Liberation Serif"/>
+          <w:rFonts w:ascii="Arial" w:hAnsi="Arial"/>
           <w:b w:val="false"/>
           <w:bCs w:val="false"/>
           <w:sz w:val="20"/>
@@ -663,7 +860,6 @@
       </w:pPr>
       <w:r>
         <w:rPr>
-          <w:rFonts w:ascii="Liberation Serif" w:hAnsi="Liberation Serif"/>
           <w:b w:val="false"/>
           <w:bCs w:val="false"/>
           <w:sz w:val="20"/>
@@ -681,10 +877,15 @@
           <w:ilvl w:val="0"/>
           <w:numId w:val="1"/>
         </w:numPr>
-        <w:spacing w:lineRule="auto" w:line="240" w:before="147" w:after="0"/>
+        <w:tabs>
+          <w:tab w:val="clear" w:pos="720"/>
+          <w:tab w:val="left" w:pos="168" w:leader="none"/>
+          <w:tab w:val="left" w:pos="288" w:leader="none"/>
+        </w:tabs>
+        <w:spacing w:lineRule="auto" w:line="240" w:before="261" w:after="114"/>
         <w:ind w:hanging="0" w:start="0" w:end="0"/>
         <w:rPr>
-          <w:rFonts w:ascii="Liberation Serif" w:hAnsi="Liberation Serif"/>
+          <w:rFonts w:ascii="Arial" w:hAnsi="Arial"/>
           <w:b/>
           <w:bCs/>
           <w:sz w:val="24"/>
@@ -693,13 +894,44 @@
       </w:pPr>
       <w:r>
         <w:rPr>
-          <w:rFonts w:ascii="Liberation Serif" w:hAnsi="Liberation Serif"/>
           <w:b/>
           <w:bCs/>
           <w:sz w:val="24"/>
           <w:szCs w:val="24"/>
         </w:rPr>
         <w:t>RECURSOS NECESSÁRIOS</w:t>
+      </w:r>
+    </w:p>
+    <w:p>
+      <w:pPr>
+        <w:pStyle w:val="Normal"/>
+        <w:widowControl w:val="false"/>
+        <w:numPr>
+          <w:ilvl w:val="0"/>
+          <w:numId w:val="0"/>
+        </w:numPr>
+        <w:tabs>
+          <w:tab w:val="clear" w:pos="720"/>
+          <w:tab w:val="left" w:pos="168" w:leader="none"/>
+          <w:tab w:val="left" w:pos="288" w:leader="none"/>
+        </w:tabs>
+        <w:spacing w:lineRule="auto" w:line="240" w:before="261" w:after="114"/>
+        <w:ind w:hanging="0" w:start="0" w:end="0"/>
+        <w:rPr>
+          <w:rFonts w:ascii="Arial" w:hAnsi="Arial"/>
+          <w:b/>
+          <w:bCs/>
+          <w:sz w:val="12"/>
+          <w:szCs w:val="12"/>
+        </w:rPr>
+      </w:pPr>
+      <w:r>
+        <w:rPr>
+          <w:b/>
+          <w:bCs/>
+          <w:sz w:val="12"/>
+          <w:szCs w:val="12"/>
+        </w:rPr>
       </w:r>
     </w:p>
     <w:p>
@@ -712,19 +944,14 @@
         <w:suppressAutoHyphens w:val="true"/>
         <w:bidi w:val="0"/>
         <w:spacing w:lineRule="auto" w:line="240" w:beforeAutospacing="0" w:before="147" w:afterAutospacing="0" w:after="0"/>
-        <w:ind w:hanging="0" w:start="737" w:end="0"/>
+        <w:ind w:hanging="0" w:start="0" w:end="0"/>
         <w:jc w:val="start"/>
         <w:rPr>
-          <w:rFonts w:ascii="Liberation Serif" w:hAnsi="Liberation Serif"/>
-          <w:b w:val="false"/>
-          <w:bCs w:val="false"/>
-          <w:sz w:val="20"/>
-          <w:szCs w:val="20"/>
-        </w:rPr>
-      </w:pPr>
-      <w:r>
-        <w:rPr>
-          <w:rFonts w:ascii="Liberation Serif" w:hAnsi="Liberation Serif"/>
+          <w:rFonts w:ascii="Arial" w:hAnsi="Arial"/>
+        </w:rPr>
+      </w:pPr>
+      <w:r>
+        <w:rPr>
           <w:b w:val="false"/>
           <w:bCs w:val="false"/>
           <w:sz w:val="20"/>
@@ -744,7 +971,7 @@
         <w:spacing w:lineRule="auto" w:line="240" w:before="147" w:after="0"/>
         <w:ind w:hanging="0" w:start="0" w:end="0"/>
         <w:rPr>
-          <w:rFonts w:ascii="Liberation Serif" w:hAnsi="Liberation Serif"/>
+          <w:rFonts w:ascii="Arial" w:hAnsi="Arial"/>
           <w:b/>
           <w:bCs/>
           <w:sz w:val="24"/>
@@ -753,7 +980,6 @@
       </w:pPr>
       <w:r>
         <w:rPr>
-          <w:rFonts w:ascii="Liberation Serif" w:hAnsi="Liberation Serif"/>
           <w:b/>
           <w:bCs/>
           <w:sz w:val="24"/>
@@ -771,10 +997,15 @@
           <w:ilvl w:val="0"/>
           <w:numId w:val="1"/>
         </w:numPr>
-        <w:spacing w:lineRule="auto" w:line="240" w:before="147" w:after="0"/>
+        <w:tabs>
+          <w:tab w:val="clear" w:pos="720"/>
+          <w:tab w:val="left" w:pos="168" w:leader="none"/>
+          <w:tab w:val="left" w:pos="288" w:leader="none"/>
+        </w:tabs>
+        <w:spacing w:lineRule="auto" w:line="240" w:before="261" w:after="114"/>
         <w:ind w:hanging="0" w:start="0" w:end="0"/>
         <w:rPr>
-          <w:rFonts w:ascii="Liberation Serif" w:hAnsi="Liberation Serif"/>
+          <w:rFonts w:ascii="Arial" w:hAnsi="Arial"/>
           <w:b/>
           <w:bCs/>
           <w:sz w:val="24"/>
@@ -783,13 +1014,44 @@
       </w:pPr>
       <w:r>
         <w:rPr>
-          <w:rFonts w:ascii="Liberation Serif" w:hAnsi="Liberation Serif"/>
           <w:b/>
           <w:bCs/>
           <w:sz w:val="24"/>
           <w:szCs w:val="24"/>
         </w:rPr>
         <w:t>COORDENADOR DO EVENTO</w:t>
+      </w:r>
+    </w:p>
+    <w:p>
+      <w:pPr>
+        <w:pStyle w:val="Normal"/>
+        <w:widowControl w:val="false"/>
+        <w:numPr>
+          <w:ilvl w:val="0"/>
+          <w:numId w:val="0"/>
+        </w:numPr>
+        <w:tabs>
+          <w:tab w:val="clear" w:pos="720"/>
+          <w:tab w:val="left" w:pos="168" w:leader="none"/>
+          <w:tab w:val="left" w:pos="288" w:leader="none"/>
+        </w:tabs>
+        <w:spacing w:lineRule="auto" w:line="240" w:before="261" w:after="114"/>
+        <w:ind w:hanging="0" w:start="0" w:end="0"/>
+        <w:rPr>
+          <w:rFonts w:ascii="Arial" w:hAnsi="Arial"/>
+          <w:b/>
+          <w:bCs/>
+          <w:sz w:val="12"/>
+          <w:szCs w:val="12"/>
+        </w:rPr>
+      </w:pPr>
+      <w:r>
+        <w:rPr>
+          <w:b/>
+          <w:bCs/>
+          <w:sz w:val="12"/>
+          <w:szCs w:val="12"/>
+        </w:rPr>
       </w:r>
     </w:p>
     <w:p>
@@ -804,16 +1066,11 @@
         <w:ind w:start="0" w:end="0"/>
         <w:jc w:val="start"/>
         <w:rPr>
-          <w:rFonts w:ascii="Liberation Serif" w:hAnsi="Liberation Serif"/>
-          <w:b w:val="false"/>
-          <w:bCs w:val="false"/>
-          <w:sz w:val="20"/>
-          <w:szCs w:val="20"/>
-        </w:rPr>
-      </w:pPr>
-      <w:r>
-        <w:rPr>
-          <w:rFonts w:ascii="Liberation Serif" w:hAnsi="Liberation Serif"/>
+          <w:rFonts w:ascii="Arial" w:hAnsi="Arial"/>
+        </w:rPr>
+      </w:pPr>
+      <w:r>
+        <w:rPr>
           <w:b w:val="false"/>
           <w:bCs w:val="false"/>
           <w:sz w:val="20"/>
@@ -833,7 +1090,7 @@
         <w:spacing w:lineRule="auto" w:line="240" w:before="147" w:after="0"/>
         <w:ind w:hanging="0" w:start="0" w:end="0"/>
         <w:rPr>
-          <w:rFonts w:ascii="Liberation Serif" w:hAnsi="Liberation Serif"/>
+          <w:rFonts w:ascii="Arial" w:hAnsi="Arial"/>
           <w:b/>
           <w:bCs/>
           <w:sz w:val="24"/>
@@ -842,7 +1099,6 @@
       </w:pPr>
       <w:r>
         <w:rPr>
-          <w:rFonts w:ascii="Liberation Serif" w:hAnsi="Liberation Serif"/>
           <w:b/>
           <w:bCs/>
           <w:sz w:val="24"/>
@@ -860,10 +1116,15 @@
           <w:ilvl w:val="0"/>
           <w:numId w:val="1"/>
         </w:numPr>
-        <w:spacing w:lineRule="auto" w:line="240" w:before="147" w:after="0"/>
+        <w:tabs>
+          <w:tab w:val="clear" w:pos="720"/>
+          <w:tab w:val="left" w:pos="168" w:leader="none"/>
+          <w:tab w:val="left" w:pos="288" w:leader="none"/>
+        </w:tabs>
+        <w:spacing w:lineRule="auto" w:line="240" w:before="261" w:after="114"/>
         <w:ind w:hanging="0" w:start="0" w:end="0"/>
         <w:rPr>
-          <w:rFonts w:ascii="Liberation Serif" w:hAnsi="Liberation Serif"/>
+          <w:rFonts w:ascii="Arial" w:hAnsi="Arial"/>
           <w:b/>
           <w:bCs/>
           <w:sz w:val="24"/>
@@ -872,13 +1133,44 @@
       </w:pPr>
       <w:r>
         <w:rPr>
-          <w:rFonts w:ascii="Liberation Serif" w:hAnsi="Liberation Serif"/>
           <w:b/>
           <w:bCs/>
           <w:sz w:val="24"/>
           <w:szCs w:val="24"/>
         </w:rPr>
         <w:t>CONSIDERAÇÕES FINAIS</w:t>
+      </w:r>
+    </w:p>
+    <w:p>
+      <w:pPr>
+        <w:pStyle w:val="Normal"/>
+        <w:widowControl w:val="false"/>
+        <w:numPr>
+          <w:ilvl w:val="0"/>
+          <w:numId w:val="0"/>
+        </w:numPr>
+        <w:tabs>
+          <w:tab w:val="clear" w:pos="720"/>
+          <w:tab w:val="left" w:pos="168" w:leader="none"/>
+          <w:tab w:val="left" w:pos="288" w:leader="none"/>
+        </w:tabs>
+        <w:spacing w:lineRule="auto" w:line="240" w:before="261" w:after="114"/>
+        <w:ind w:hanging="0" w:start="0" w:end="0"/>
+        <w:rPr>
+          <w:rFonts w:ascii="Arial" w:hAnsi="Arial"/>
+          <w:b/>
+          <w:bCs/>
+          <w:sz w:val="12"/>
+          <w:szCs w:val="12"/>
+        </w:rPr>
+      </w:pPr>
+      <w:r>
+        <w:rPr>
+          <w:b/>
+          <w:bCs/>
+          <w:sz w:val="12"/>
+          <w:szCs w:val="12"/>
+        </w:rPr>
       </w:r>
     </w:p>
     <w:p>
@@ -893,21 +1185,16 @@
         <w:ind w:start="0" w:end="0"/>
         <w:jc w:val="start"/>
         <w:rPr>
-          <w:rFonts w:ascii="Liberation Serif" w:hAnsi="Liberation Serif"/>
+          <w:rFonts w:ascii="Arial" w:hAnsi="Arial"/>
+        </w:rPr>
+      </w:pPr>
+      <w:r>
+        <w:rPr>
           <w:b w:val="false"/>
           <w:bCs w:val="false"/>
           <w:sz w:val="20"/>
           <w:szCs w:val="20"/>
         </w:rPr>
-      </w:pPr>
-      <w:r>
-        <w:rPr>
-          <w:rFonts w:ascii="Liberation Serif" w:hAnsi="Liberation Serif"/>
-          <w:b w:val="false"/>
-          <w:bCs w:val="false"/>
-          <w:sz w:val="20"/>
-          <w:szCs w:val="20"/>
-        </w:rPr>
         <w:t>{{consideracao_final}}</w:t>
       </w:r>
     </w:p>
@@ -921,6 +1208,7 @@
         <w:ind w:start="720" w:end="-4"/>
         <w:jc w:val="both"/>
         <w:rPr>
+          <w:rFonts w:ascii="Arial" w:hAnsi="Arial"/>
           <w:b/>
           <w:bCs/>
           <w:color w:val="000009"/>
@@ -948,6 +1236,7 @@
         <w:ind w:start="720" w:end="-4"/>
         <w:jc w:val="both"/>
         <w:rPr>
+          <w:rFonts w:ascii="Arial" w:hAnsi="Arial"/>
           <w:b/>
           <w:bCs/>
           <w:color w:val="000009"/>
@@ -974,11 +1263,32 @@
         <w:spacing w:lineRule="auto" w:line="240"/>
         <w:ind w:end="19"/>
         <w:jc w:val="center"/>
-        <w:rPr/>
+        <w:rPr>
+          <w:rFonts w:ascii="Arial" w:hAnsi="Arial"/>
+        </w:rPr>
       </w:pPr>
       <w:r>
         <w:rPr/>
         <w:t>{{sede}}, {{data_extenso}}</w:t>
+      </w:r>
+    </w:p>
+    <w:p>
+      <w:pPr>
+        <w:pStyle w:val="Normal"/>
+        <w:keepNext w:val="true"/>
+        <w:keepLines/>
+        <w:widowControl w:val="false"/>
+        <w:suppressAutoHyphens w:val="true"/>
+        <w:bidi w:val="0"/>
+        <w:spacing w:lineRule="auto" w:line="360" w:before="0" w:after="0"/>
+        <w:ind w:hanging="0" w:start="0" w:end="0"/>
+        <w:jc w:val="center"/>
+        <w:rPr>
+          <w:rFonts w:ascii="Arial" w:hAnsi="Arial"/>
+        </w:rPr>
+      </w:pPr>
+      <w:r>
+        <w:rPr/>
       </w:r>
     </w:p>
     <w:p>
@@ -990,10 +1300,18 @@
         <w:spacing w:lineRule="auto" w:line="360"/>
         <w:ind w:end="19"/>
         <w:jc w:val="center"/>
-        <w:rPr/>
-      </w:pPr>
-      <w:r>
-        <w:rPr/>
+        <w:rPr>
+          <w:rFonts w:ascii="Arial" w:hAnsi="Arial"/>
+        </w:rPr>
+      </w:pPr>
+      <w:r>
+        <w:rPr>
+          <w:b/>
+          <w:bCs/>
+          <w:sz w:val="20"/>
+          <w:szCs w:val="20"/>
+        </w:rPr>
+        <w:t>{{nome_chefia}}</w:t>
       </w:r>
     </w:p>
     <w:p>
@@ -1006,36 +1324,7 @@
         <w:ind w:end="19"/>
         <w:jc w:val="center"/>
         <w:rPr>
-          <w:b/>
-          <w:bCs/>
-          <w:sz w:val="20"/>
-          <w:szCs w:val="20"/>
-        </w:rPr>
-      </w:pPr>
-      <w:r>
-        <w:rPr>
-          <w:b/>
-          <w:bCs/>
-          <w:sz w:val="20"/>
-          <w:szCs w:val="20"/>
-        </w:rPr>
-        <w:t>{{nome_chefia}}</w:t>
-      </w:r>
-    </w:p>
-    <w:p>
-      <w:pPr>
-        <w:pStyle w:val="Normal"/>
-        <w:keepNext w:val="true"/>
-        <w:keepLines/>
-        <w:widowControl w:val="false"/>
-        <w:spacing w:lineRule="auto" w:line="360"/>
-        <w:ind w:end="19"/>
-        <w:jc w:val="center"/>
-        <w:rPr>
-          <w:b/>
-          <w:bCs/>
-          <w:sz w:val="20"/>
-          <w:szCs w:val="20"/>
+          <w:rFonts w:ascii="Arial" w:hAnsi="Arial"/>
         </w:rPr>
       </w:pPr>
       <w:r>
@@ -1056,6 +1345,7 @@
         <w:ind w:end="-4"/>
         <w:jc w:val="center"/>
         <w:rPr>
+          <w:rFonts w:ascii="Arial" w:hAnsi="Arial"/>
           <w:b/>
           <w:bCs/>
           <w:color w:val="000009"/>
@@ -1128,7 +1418,7 @@
     </w:r>
     <w:r>
       <w:rPr/>
-      <w:t>2</w:t>
+      <w:t>3</w:t>
     </w:r>
     <w:r>
       <w:rPr/>
@@ -1285,7 +1575,7 @@
     </w:r>
     <w:r>
       <w:rPr/>
-      <w:t>2</w:t>
+      <w:t>3</w:t>
     </w:r>
     <w:r>
       <w:rPr/>

</xml_diff>

<commit_message>
feat: Refactor plano_trabalho document generation and improve resource formatting
</commit_message>
<xml_diff>
--- a/documentos/resources/plano_trabalho.docx
+++ b/documentos/resources/plano_trabalho.docx
@@ -2,11 +2,11 @@
 <file path=word/document.xml><?xml version="1.0" encoding="utf-8"?>
 <w:document xmlns:o="urn:schemas-microsoft-com:office:office" xmlns:r="http://schemas.openxmlformats.org/officeDocument/2006/relationships" xmlns:v="urn:schemas-microsoft-com:vml" xmlns:w="http://schemas.openxmlformats.org/wordprocessingml/2006/main" xmlns:w10="urn:schemas-microsoft-com:office:word" xmlns:wp="http://schemas.openxmlformats.org/drawingml/2006/wordprocessingDrawing" xmlns:pic="http://schemas.openxmlformats.org/drawingml/2006/picture" xmlns:wps="http://schemas.microsoft.com/office/word/2010/wordprocessingShape" xmlns:wpg="http://schemas.microsoft.com/office/word/2010/wordprocessingGroup" xmlns:mc="http://schemas.openxmlformats.org/markup-compatibility/2006" xmlns:wp14="http://schemas.microsoft.com/office/word/2010/wordprocessingDrawing" xmlns:w14="http://schemas.microsoft.com/office/word/2010/wordml" xmlns:w15="http://schemas.microsoft.com/office/word/2012/wordml" mc:Ignorable="w14 wp14 w15">
   <w:body>
-    <w:p>
+    <w:p xmlns:wp14="http://schemas.microsoft.com/office/word/2010/wordml" wp14:textId="77777777">
       <w:pPr>
         <w:pStyle w:val="Normal"/>
         <w:widowControl w:val="false"/>
-        <w:spacing w:lineRule="auto" w:line="240" w:before="147" w:after="0"/>
+        <w:spacing w:before="147" w:after="0" w:line="240" w:lineRule="auto"/>
         <w:jc w:val="center"/>
         <w:rPr>
           <w:b/>
@@ -26,11 +26,11 @@
         </w:rPr>
       </w:r>
     </w:p>
-    <w:p>
+    <w:p xmlns:wp14="http://schemas.microsoft.com/office/word/2010/wordml" wp14:textId="77777777">
       <w:pPr>
         <w:pStyle w:val="Normal"/>
         <w:widowControl w:val="false"/>
-        <w:spacing w:lineRule="auto" w:line="240" w:before="147" w:after="0"/>
+        <w:spacing w:before="147" w:after="0" w:line="240" w:lineRule="auto"/>
         <w:jc w:val="center"/>
         <w:rPr>
           <w:b/>
@@ -50,11 +50,11 @@
         </w:rPr>
       </w:r>
     </w:p>
-    <w:p>
+    <w:p xmlns:wp14="http://schemas.microsoft.com/office/word/2010/wordml" wp14:textId="77777777">
       <w:pPr>
         <w:pStyle w:val="Normal"/>
         <w:widowControl w:val="false"/>
-        <w:spacing w:lineRule="auto" w:line="240" w:before="147" w:after="0"/>
+        <w:spacing w:before="147" w:after="0" w:line="240" w:lineRule="auto"/>
         <w:jc w:val="center"/>
         <w:rPr>
           <w:b/>
@@ -74,11 +74,11 @@
         </w:rPr>
       </w:r>
     </w:p>
-    <w:p>
+    <w:p xmlns:wp14="http://schemas.microsoft.com/office/word/2010/wordml" wp14:textId="77777777">
       <w:pPr>
         <w:pStyle w:val="Normal"/>
         <w:widowControl w:val="false"/>
-        <w:spacing w:lineRule="auto" w:line="240" w:before="147" w:after="0"/>
+        <w:spacing w:before="147" w:after="0" w:line="240" w:lineRule="auto"/>
         <w:jc w:val="center"/>
         <w:rPr>
           <w:rFonts w:ascii="Arial" w:hAnsi="Arial"/>
@@ -95,11 +95,11 @@
         <w:t>PLANO DE TRABALHO Nº{{numero_plano_trabalho}}</w:t>
       </w:r>
     </w:p>
-    <w:p>
+    <w:p xmlns:wp14="http://schemas.microsoft.com/office/word/2010/wordml" wp14:textId="77777777">
       <w:pPr>
         <w:pStyle w:val="Normal"/>
         <w:widowControl w:val="false"/>
-        <w:spacing w:lineRule="auto" w:line="240" w:before="147" w:after="0"/>
+        <w:spacing w:before="147" w:after="0" w:line="240" w:lineRule="auto"/>
         <w:jc w:val="center"/>
         <w:rPr>
           <w:rFonts w:ascii="Arial" w:hAnsi="Arial"/>
@@ -116,11 +116,11 @@
         <w:t>{{unidade}}</w:t>
       </w:r>
     </w:p>
-    <w:p>
+    <w:p xmlns:wp14="http://schemas.microsoft.com/office/word/2010/wordml" wp14:textId="77777777">
       <w:pPr>
         <w:pStyle w:val="Normal"/>
         <w:widowControl w:val="false"/>
-        <w:spacing w:lineRule="auto" w:line="240" w:before="147" w:after="0"/>
+        <w:spacing w:before="147" w:after="0" w:line="240" w:lineRule="auto"/>
         <w:jc w:val="center"/>
         <w:rPr>
           <w:rFonts w:ascii="Arial" w:hAnsi="Arial"/>
@@ -130,11 +130,11 @@
         <w:rPr/>
       </w:r>
     </w:p>
-    <w:p>
+    <w:p xmlns:wp14="http://schemas.microsoft.com/office/word/2010/wordml" wp14:textId="77777777">
       <w:pPr>
         <w:pStyle w:val="Normal"/>
         <w:widowControl w:val="false"/>
-        <w:spacing w:lineRule="auto" w:line="240" w:before="147" w:after="0"/>
+        <w:spacing w:before="147" w:after="0" w:line="240" w:lineRule="auto"/>
         <w:jc w:val="center"/>
         <w:rPr>
           <w:rFonts w:ascii="Arial" w:hAnsi="Arial"/>
@@ -144,11 +144,11 @@
         <w:rPr/>
       </w:r>
     </w:p>
-    <w:p>
+    <w:p xmlns:wp14="http://schemas.microsoft.com/office/word/2010/wordml" wp14:textId="77777777">
       <w:pPr>
         <w:pStyle w:val="Normal"/>
         <w:widowControl w:val="false"/>
-        <w:spacing w:lineRule="auto" w:line="240" w:before="147" w:after="0"/>
+        <w:spacing w:before="147" w:after="0" w:line="240" w:lineRule="auto"/>
         <w:jc w:val="center"/>
         <w:rPr>
           <w:rFonts w:ascii="Arial" w:hAnsi="Arial"/>
@@ -158,11 +158,11 @@
         <w:rPr/>
       </w:r>
     </w:p>
-    <w:p>
+    <w:p xmlns:wp14="http://schemas.microsoft.com/office/word/2010/wordml" wp14:textId="77777777">
       <w:pPr>
         <w:pStyle w:val="Normal"/>
         <w:widowControl w:val="false"/>
-        <w:spacing w:lineRule="auto" w:line="240" w:before="147" w:after="0"/>
+        <w:spacing w:before="147" w:after="0" w:line="240" w:lineRule="auto"/>
         <w:jc w:val="center"/>
         <w:rPr>
           <w:rFonts w:ascii="Arial" w:hAnsi="Arial"/>
@@ -172,11 +172,11 @@
         <w:rPr/>
       </w:r>
     </w:p>
-    <w:p>
+    <w:p xmlns:wp14="http://schemas.microsoft.com/office/word/2010/wordml" wp14:textId="77777777">
       <w:pPr>
         <w:pStyle w:val="Normal"/>
         <w:widowControl w:val="false"/>
-        <w:spacing w:lineRule="auto" w:line="240" w:before="147" w:after="0"/>
+        <w:spacing w:before="147" w:after="0" w:line="240" w:lineRule="auto"/>
         <w:jc w:val="center"/>
         <w:rPr>
           <w:rFonts w:ascii="Arial" w:hAnsi="Arial"/>
@@ -186,99 +186,89 @@
         <w:rPr/>
       </w:r>
     </w:p>
-    <w:p>
-      <w:pPr>
-        <w:pStyle w:val="Normal"/>
-        <w:keepNext w:val="true"/>
-        <w:keepLines/>
-        <w:widowControl w:val="false"/>
+    <w:p xmlns:wp14="http://schemas.microsoft.com/office/word/2010/wordml" wp14:textId="77777777">
+      <w:pPr>
+        <w:pStyle w:val="Normal"/>
+        <w:keepNext w:val="1"/>
+        <w:keepLines w:val="1"/>
+        <w:widowControl w:val="0"/>
         <w:numPr>
           <w:ilvl w:val="0"/>
           <w:numId w:val="1"/>
         </w:numPr>
         <w:tabs>
           <w:tab w:val="clear" w:pos="720"/>
-          <w:tab w:val="left" w:pos="168" w:leader="none"/>
-          <w:tab w:val="left" w:pos="288" w:leader="none"/>
+          <w:tab w:val="left" w:leader="none" w:pos="168"/>
+          <w:tab w:val="left" w:leader="none" w:pos="288"/>
         </w:tabs>
         <w:suppressAutoHyphens w:val="true"/>
         <w:bidi w:val="0"/>
-        <w:spacing w:lineRule="auto" w:line="240" w:before="261" w:after="114"/>
-        <w:ind w:hanging="0" w:start="0" w:end="0"/>
-        <w:jc w:val="start"/>
-        <w:rPr>
-          <w:rFonts w:ascii="Arial" w:hAnsi="Arial"/>
-        </w:rPr>
-      </w:pPr>
-      <w:r>
-        <w:rPr>
-          <w:b/>
-          <w:bCs/>
+        <w:spacing w:before="261" w:after="114" w:line="240" w:lineRule="auto"/>
+        <w:ind w:left="360" w:start="0" w:end="0"/>
+        <w:rPr>
+          <w:rFonts w:ascii="Arial" w:hAnsi="Arial"/>
+          <w:b w:val="1"/>
+          <w:bCs w:val="1"/>
+        </w:rPr>
+      </w:pPr>
+      <w:r>
+        <w:rPr>
+          <w:b w:val="1"/>
+          <w:bCs w:val="1"/>
           <w:sz w:val="24"/>
           <w:szCs w:val="24"/>
         </w:rPr>
         <w:t>BREVE CONTEXTUALIZAÇÃO</w:t>
       </w:r>
     </w:p>
-    <w:p>
-      <w:pPr>
-        <w:pStyle w:val="Normal"/>
-        <w:widowControl w:val="false"/>
-        <w:numPr>
-          <w:ilvl w:val="0"/>
-          <w:numId w:val="0"/>
-        </w:numPr>
+    <w:p xmlns:wp14="http://schemas.microsoft.com/office/word/2010/wordml" wp14:textId="77777777">
+      <w:pPr>
+        <w:pStyle w:val="Normal"/>
+        <w:keepNext w:val="1"/>
+        <w:keepLines w:val="1"/>
+        <w:widowControl w:val="0"/>
         <w:tabs>
           <w:tab w:val="clear" w:pos="720"/>
-          <w:tab w:val="left" w:pos="168" w:leader="none"/>
-          <w:tab w:val="left" w:pos="288" w:leader="none"/>
+          <w:tab w:val="left" w:leader="none" w:pos="168"/>
+          <w:tab w:val="left" w:leader="none" w:pos="288"/>
         </w:tabs>
         <w:suppressAutoHyphens w:val="true"/>
         <w:bidi w:val="0"/>
-        <w:spacing w:lineRule="auto" w:line="240" w:before="261" w:after="114"/>
-        <w:ind w:hanging="0" w:start="0" w:end="0"/>
-        <w:jc w:val="start"/>
-        <w:rPr>
-          <w:rFonts w:ascii="Arial" w:hAnsi="Arial"/>
-          <w:b/>
-          <w:bCs/>
+        <w:spacing w:before="261" w:after="114" w:line="240" w:lineRule="auto"/>
+        <w:ind w:start="0" w:end="0" w:hanging="0"/>
+        <w:rPr>
+          <w:rFonts w:ascii="Arial" w:hAnsi="Arial"/>
+          <w:b w:val="1"/>
+          <w:bCs w:val="1"/>
           <w:sz w:val="12"/>
           <w:szCs w:val="12"/>
         </w:rPr>
       </w:pPr>
-      <w:r>
-        <w:rPr>
-          <w:b/>
-          <w:bCs/>
-          <w:sz w:val="12"/>
-          <w:szCs w:val="12"/>
-        </w:rPr>
-      </w:r>
-    </w:p>
-    <w:p>
-      <w:pPr>
-        <w:pStyle w:val="Normal"/>
-        <w:keepNext w:val="true"/>
-        <w:keepLines/>
-        <w:widowControl w:val="false"/>
+    </w:p>
+    <w:p xmlns:wp14="http://schemas.microsoft.com/office/word/2010/wordml" wp14:textId="77777777">
+      <w:pPr>
+        <w:pStyle w:val="Normal"/>
+        <w:keepNext w:val="1"/>
+        <w:keepLines w:val="1"/>
+        <w:widowControl w:val="0"/>
         <w:bidi w:val="0"/>
-        <w:spacing w:lineRule="auto" w:line="240" w:before="90" w:after="0"/>
-        <w:ind w:hanging="0" w:start="0" w:end="0"/>
-        <w:rPr>
-          <w:rFonts w:ascii="Arial" w:hAnsi="Arial"/>
-        </w:rPr>
-      </w:pPr>
-      <w:r>
-        <w:rPr>
-          <w:b w:val="false"/>
-          <w:bCs w:val="false"/>
+        <w:spacing w:before="90" w:after="0" w:line="240" w:lineRule="auto"/>
+        <w:ind w:start="0" w:end="0"/>
+        <w:rPr>
+          <w:rFonts w:ascii="Arial" w:hAnsi="Arial"/>
+        </w:rPr>
+      </w:pPr>
+      <w:r>
+        <w:rPr>
+          <w:b w:val="0"/>
+          <w:bCs w:val="0"/>
           <w:sz w:val="20"/>
           <w:szCs w:val="20"/>
         </w:rPr>
         <w:t>{{contextualizacao}}</w:t>
       </w:r>
     </w:p>
-    <w:p>
+    <w:p xmlns:wp14="http://schemas.microsoft.com/office/word/2010/wordml" wp14:textId="77777777">
       <w:pPr>
         <w:pStyle w:val="Normal"/>
         <w:widowControl w:val="false"/>
@@ -287,8 +277,8 @@
           <w:numId w:val="0"/>
         </w:numPr>
         <w:bidi w:val="0"/>
-        <w:spacing w:lineRule="auto" w:line="240" w:before="204" w:after="57"/>
-        <w:ind w:hanging="0" w:start="0" w:end="0"/>
+        <w:spacing w:before="204" w:after="57" w:line="240" w:lineRule="auto"/>
+        <w:ind w:start="0" w:end="0" w:hanging="0"/>
         <w:jc w:val="start"/>
         <w:rPr>
           <w:rFonts w:ascii="Arial" w:hAnsi="Arial"/>
@@ -307,42 +297,68 @@
         </w:rPr>
       </w:r>
     </w:p>
-    <w:p>
-      <w:pPr>
-        <w:pStyle w:val="Normal"/>
-        <w:keepNext w:val="true"/>
-        <w:keepLines/>
-        <w:widowControl w:val="false"/>
+    <w:p xmlns:wp14="http://schemas.microsoft.com/office/word/2010/wordml" wp14:textId="3CC2F5AD">
+      <w:pPr>
+        <w:pStyle w:val="Normal"/>
+        <w:keepNext w:val="1"/>
+        <w:keepLines w:val="1"/>
+        <w:widowControl w:val="0"/>
         <w:numPr>
           <w:ilvl w:val="0"/>
           <w:numId w:val="1"/>
         </w:numPr>
+        <w:suppressLineNumbers w:val="0"/>
         <w:tabs>
-          <w:tab w:val="clear" w:pos="720"/>
-          <w:tab w:val="left" w:pos="168" w:leader="none"/>
-          <w:tab w:val="left" w:pos="288" w:leader="none"/>
+          <w:tab w:val="clear" w:leader="none" w:pos="720"/>
+          <w:tab w:val="left" w:leader="none" w:pos="168"/>
+          <w:tab w:val="left" w:leader="none" w:pos="288"/>
         </w:tabs>
-        <w:spacing w:lineRule="auto" w:line="240" w:before="261" w:after="114"/>
-        <w:ind w:hanging="0" w:start="0" w:end="0"/>
-        <w:rPr>
-          <w:rFonts w:ascii="Arial" w:hAnsi="Arial"/>
-          <w:b/>
-          <w:bCs/>
-          <w:sz w:val="24"/>
-          <w:szCs w:val="24"/>
-        </w:rPr>
-      </w:pPr>
-      <w:r>
-        <w:rPr>
-          <w:b/>
-          <w:bCs/>
+        <w:bidi w:val="0"/>
+        <w:spacing w:before="261" w:beforeAutospacing="off" w:after="114" w:afterAutospacing="off" w:line="240" w:lineRule="auto"/>
+        <w:ind w:left="360" w:right="0" w:hanging="360"/>
+        <w:jc w:val="left"/>
+        <w:rPr>
+          <w:b w:val="1"/>
+          <w:bCs w:val="1"/>
+          <w:sz w:val="24"/>
+          <w:szCs w:val="24"/>
+        </w:rPr>
+      </w:pPr>
+      <w:r>
+        <w:rPr>
+          <w:b w:val="1"/>
+          <w:bCs w:val="1"/>
           <w:sz w:val="24"/>
           <w:szCs w:val="24"/>
         </w:rPr>
         <w:t>METAS ESTABELECIDAS</w:t>
       </w:r>
     </w:p>
-    <w:p>
+    <w:p xmlns:wp14="http://schemas.microsoft.com/office/word/2010/wordml" wp14:textId="77777777">
+      <w:pPr>
+        <w:pStyle w:val="Normal"/>
+        <w:keepNext w:val="1"/>
+        <w:keepLines w:val="1"/>
+        <w:widowControl w:val="0"/>
+        <w:suppressAutoHyphens w:val="true"/>
+        <w:bidi w:val="0"/>
+        <w:spacing w:before="147" w:after="0" w:line="240" w:lineRule="auto"/>
+        <w:ind w:left="270" w:start="0" w:end="0" w:hanging="0"/>
+        <w:rPr>
+          <w:rFonts w:ascii="Arial" w:hAnsi="Arial"/>
+        </w:rPr>
+      </w:pPr>
+      <w:r>
+        <w:rPr>
+          <w:b w:val="0"/>
+          <w:bCs w:val="0"/>
+          <w:sz w:val="20"/>
+          <w:szCs w:val="20"/>
+        </w:rPr>
+        <w:t>{{metas}}</w:t>
+      </w:r>
+    </w:p>
+    <w:p xmlns:wp14="http://schemas.microsoft.com/office/word/2010/wordml" wp14:textId="77777777">
       <w:pPr>
         <w:pStyle w:val="Normal"/>
         <w:widowControl w:val="false"/>
@@ -350,31 +366,785 @@
           <w:ilvl w:val="0"/>
           <w:numId w:val="0"/>
         </w:numPr>
+        <w:spacing w:before="147" w:after="0" w:line="240" w:lineRule="auto"/>
+        <w:ind w:start="0" w:end="0" w:hanging="0"/>
+        <w:rPr>
+          <w:rFonts w:ascii="Arial" w:hAnsi="Arial"/>
+          <w:b/>
+          <w:bCs/>
+          <w:sz w:val="24"/>
+          <w:szCs w:val="24"/>
+        </w:rPr>
+      </w:pPr>
+      <w:r>
+        <w:rPr>
+          <w:b/>
+          <w:bCs/>
+          <w:sz w:val="24"/>
+          <w:szCs w:val="24"/>
+        </w:rPr>
+      </w:r>
+    </w:p>
+    <w:p xmlns:wp14="http://schemas.microsoft.com/office/word/2010/wordml" wp14:textId="36B7881F">
+      <w:pPr>
+        <w:pStyle w:val="Normal"/>
+        <w:keepNext w:val="1"/>
+        <w:keepLines w:val="1"/>
+        <w:widowControl w:val="0"/>
+        <w:numPr>
+          <w:ilvl w:val="0"/>
+          <w:numId w:val="1"/>
+        </w:numPr>
+        <w:suppressLineNumbers w:val="0"/>
+        <w:tabs>
+          <w:tab w:val="clear" w:leader="none" w:pos="720"/>
+          <w:tab w:val="left" w:leader="none" w:pos="168"/>
+          <w:tab w:val="left" w:leader="none" w:pos="288"/>
+        </w:tabs>
+        <w:bidi w:val="0"/>
+        <w:spacing w:before="261" w:beforeAutospacing="off" w:after="114" w:afterAutospacing="off" w:line="240" w:lineRule="auto"/>
+        <w:ind w:left="360" w:right="0" w:hanging="360"/>
+        <w:jc w:val="left"/>
+        <w:rPr>
+          <w:b w:val="1"/>
+          <w:bCs w:val="1"/>
+          <w:sz w:val="24"/>
+          <w:szCs w:val="24"/>
+        </w:rPr>
+      </w:pPr>
+      <w:r>
+        <w:rPr>
+          <w:b w:val="1"/>
+          <w:bCs w:val="1"/>
+          <w:sz w:val="24"/>
+          <w:szCs w:val="24"/>
+        </w:rPr>
+        <w:t>ATIVIDADES A SEREM DESENVOLVIDAS</w:t>
+      </w:r>
+    </w:p>
+    <w:p xmlns:wp14="http://schemas.microsoft.com/office/word/2010/wordml" wp14:textId="77777777">
+      <w:pPr>
+        <w:pStyle w:val="Normal"/>
+        <w:keepNext w:val="1"/>
+        <w:keepLines w:val="1"/>
+        <w:widowControl w:val="0"/>
+        <w:suppressAutoHyphens w:val="true"/>
+        <w:bidi w:val="0"/>
+        <w:spacing w:before="147" w:after="0" w:line="240" w:lineRule="auto"/>
+        <w:ind w:left="270" w:start="0" w:end="0" w:hanging="0"/>
+        <w:rPr>
+          <w:rFonts w:ascii="Arial" w:hAnsi="Arial"/>
+        </w:rPr>
+      </w:pPr>
+      <w:r>
+        <w:rPr>
+          <w:b w:val="0"/>
+          <w:bCs w:val="0"/>
+          <w:sz w:val="20"/>
+          <w:szCs w:val="20"/>
+        </w:rPr>
+        <w:t>{{atividades}}</w:t>
+      </w:r>
+    </w:p>
+    <w:p xmlns:wp14="http://schemas.microsoft.com/office/word/2010/wordml" wp14:textId="77777777">
+      <w:pPr>
+        <w:pStyle w:val="Normal"/>
+        <w:widowControl w:val="false"/>
+        <w:spacing w:before="147" w:after="0" w:line="240" w:lineRule="auto"/>
+        <w:ind w:start="0" w:end="0" w:hanging="0"/>
+        <w:rPr>
+          <w:rFonts w:ascii="Arial" w:hAnsi="Arial"/>
+          <w:b/>
+          <w:bCs/>
+          <w:sz w:val="24"/>
+          <w:szCs w:val="24"/>
+        </w:rPr>
+      </w:pPr>
+      <w:r>
+        <w:rPr>
+          <w:b/>
+          <w:bCs/>
+          <w:sz w:val="24"/>
+          <w:szCs w:val="24"/>
+        </w:rPr>
+      </w:r>
+    </w:p>
+    <w:p xmlns:wp14="http://schemas.microsoft.com/office/word/2010/wordml" wp14:textId="77777777">
+      <w:pPr>
+        <w:pStyle w:val="Normal"/>
+        <w:keepNext w:val="1"/>
+        <w:keepLines w:val="1"/>
+        <w:widowControl w:val="0"/>
+        <w:numPr>
+          <w:ilvl w:val="0"/>
+          <w:numId w:val="1"/>
+        </w:numPr>
+        <w:suppressLineNumbers w:val="0"/>
+        <w:tabs>
+          <w:tab w:val="clear" w:leader="none" w:pos="720"/>
+          <w:tab w:val="left" w:leader="none" w:pos="168"/>
+          <w:tab w:val="left" w:leader="none" w:pos="288"/>
+        </w:tabs>
+        <w:bidi w:val="0"/>
+        <w:spacing w:before="261" w:beforeAutospacing="off" w:after="114" w:afterAutospacing="off" w:line="240" w:lineRule="auto"/>
+        <w:ind w:left="360" w:right="0" w:hanging="360"/>
+        <w:jc w:val="left"/>
+        <w:rPr>
+          <w:b w:val="1"/>
+          <w:bCs w:val="1"/>
+          <w:sz w:val="24"/>
+          <w:szCs w:val="24"/>
+        </w:rPr>
+      </w:pPr>
+      <w:r>
+        <w:rPr>
+          <w:b w:val="1"/>
+          <w:bCs w:val="1"/>
+          <w:sz w:val="24"/>
+          <w:szCs w:val="24"/>
+        </w:rPr>
+        <w:t>ATUAÇÃO</w:t>
+      </w:r>
+    </w:p>
+    <w:p xmlns:wp14="http://schemas.microsoft.com/office/word/2010/wordml" wp14:textId="77777777">
+      <w:pPr>
+        <w:pStyle w:val="Normal"/>
+        <w:keepNext w:val="1"/>
+        <w:keepLines w:val="1"/>
+        <w:widowControl w:val="0"/>
+        <w:spacing w:before="147" w:after="0" w:line="240" w:lineRule="auto"/>
+        <w:ind w:left="270" w:start="720" w:end="0" w:hanging="0"/>
+        <w:rPr>
+          <w:rFonts w:ascii="Arial" w:hAnsi="Arial"/>
+        </w:rPr>
+      </w:pPr>
+      <w:r>
+        <w:rPr>
+          <w:b w:val="1"/>
+          <w:bCs w:val="1"/>
+          <w:sz w:val="20"/>
+          <w:szCs w:val="20"/>
+        </w:rPr>
+        <w:t>Datas:</w:t>
+      </w:r>
+      <w:r>
+        <w:rPr>
+          <w:b w:val="0"/>
+          <w:bCs w:val="0"/>
+          <w:sz w:val="20"/>
+          <w:szCs w:val="20"/>
+        </w:rPr>
+        <w:t xml:space="preserve"> {{data_evento}}; </w:t>
+      </w:r>
+    </w:p>
+    <w:p xmlns:wp14="http://schemas.microsoft.com/office/word/2010/wordml" wp14:textId="77777777">
+      <w:pPr>
+        <w:pStyle w:val="Normal"/>
+        <w:keepNext w:val="1"/>
+        <w:keepLines w:val="1"/>
+        <w:widowControl w:val="0"/>
+        <w:spacing w:before="147" w:after="0" w:line="240" w:lineRule="auto"/>
+        <w:ind w:left="270" w:start="720" w:end="0" w:hanging="0"/>
+        <w:rPr>
+          <w:rFonts w:ascii="Arial" w:hAnsi="Arial"/>
+        </w:rPr>
+      </w:pPr>
+      <w:r>
+        <w:rPr>
+          <w:b w:val="1"/>
+          <w:bCs w:val="1"/>
+          <w:sz w:val="20"/>
+          <w:szCs w:val="20"/>
+        </w:rPr>
+        <w:t>Local:</w:t>
+      </w:r>
+      <w:r>
+        <w:rPr>
+          <w:b w:val="0"/>
+          <w:bCs w:val="0"/>
+          <w:sz w:val="20"/>
+          <w:szCs w:val="20"/>
+        </w:rPr>
+        <w:t xml:space="preserve"> {{destinos}}; </w:t>
+      </w:r>
+    </w:p>
+    <w:p xmlns:wp14="http://schemas.microsoft.com/office/word/2010/wordml" wp14:textId="77777777">
+      <w:pPr>
+        <w:pStyle w:val="Normal"/>
+        <w:keepNext w:val="1"/>
+        <w:keepLines w:val="1"/>
+        <w:widowControl w:val="0"/>
+        <w:spacing w:before="147" w:after="0" w:line="240" w:lineRule="auto"/>
+        <w:ind w:left="270" w:start="720" w:end="0" w:hanging="0"/>
+        <w:rPr>
+          <w:rFonts w:ascii="Arial" w:hAnsi="Arial"/>
+        </w:rPr>
+      </w:pPr>
+      <w:r>
+        <w:rPr>
+          <w:b w:val="1"/>
+          <w:bCs w:val="1"/>
+          <w:sz w:val="20"/>
+          <w:szCs w:val="20"/>
+        </w:rPr>
+        <w:t>Horário de atendimento:</w:t>
+      </w:r>
+      <w:r>
+        <w:rPr>
+          <w:b w:val="0"/>
+          <w:bCs w:val="0"/>
+          <w:sz w:val="20"/>
+          <w:szCs w:val="20"/>
+        </w:rPr>
+        <w:t xml:space="preserve"> {{horario_de_atendimento}};</w:t>
+      </w:r>
+    </w:p>
+    <w:p xmlns:wp14="http://schemas.microsoft.com/office/word/2010/wordml" wp14:textId="77777777">
+      <w:pPr>
+        <w:pStyle w:val="Normal"/>
+        <w:keepNext w:val="1"/>
+        <w:keepLines w:val="1"/>
+        <w:widowControl w:val="0"/>
+        <w:spacing w:before="147" w:after="0" w:line="240" w:lineRule="auto"/>
+        <w:ind w:left="270" w:start="720" w:end="0" w:hanging="0"/>
+        <w:rPr>
+          <w:rFonts w:ascii="Arial" w:hAnsi="Arial"/>
+        </w:rPr>
+      </w:pPr>
+      <w:r>
+        <w:rPr>
+          <w:b w:val="1"/>
+          <w:bCs w:val="1"/>
+          <w:sz w:val="20"/>
+          <w:szCs w:val="20"/>
+        </w:rPr>
+        <w:t>Efetivo total:</w:t>
+      </w:r>
+      <w:r>
+        <w:rPr>
+          <w:b w:val="0"/>
+          <w:bCs w:val="0"/>
+          <w:sz w:val="20"/>
+          <w:szCs w:val="20"/>
+        </w:rPr>
+        <w:t xml:space="preserve"> {{efetivos}}; </w:t>
+      </w:r>
+    </w:p>
+    <w:p xmlns:wp14="http://schemas.microsoft.com/office/word/2010/wordml" wp14:textId="77777777">
+      <w:pPr>
+        <w:pStyle w:val="Normal"/>
+        <w:keepNext w:val="1"/>
+        <w:keepLines w:val="1"/>
+        <w:widowControl w:val="0"/>
+        <w:spacing w:before="147" w:after="0" w:line="240" w:lineRule="auto"/>
+        <w:ind w:left="270" w:start="720" w:hanging="0"/>
+        <w:rPr>
+          <w:rFonts w:ascii="Arial" w:hAnsi="Arial"/>
+        </w:rPr>
+      </w:pPr>
+      <w:r>
+        <w:rPr>
+          <w:b w:val="0"/>
+          <w:bCs w:val="0"/>
+          <w:sz w:val="20"/>
+          <w:szCs w:val="20"/>
+        </w:rPr>
+        <w:t>{{unidade_movel}}</w:t>
+      </w:r>
+    </w:p>
+    <w:p xmlns:wp14="http://schemas.microsoft.com/office/word/2010/wordml" wp14:textId="77777777">
+      <w:pPr>
+        <w:pStyle w:val="Normal"/>
+        <w:widowControl w:val="false"/>
+        <w:numPr>
+          <w:ilvl w:val="0"/>
+          <w:numId w:val="0"/>
+        </w:numPr>
+        <w:spacing w:before="147" w:after="0" w:line="240" w:lineRule="auto"/>
+        <w:ind w:start="0" w:end="0" w:hanging="0"/>
+        <w:rPr>
+          <w:rFonts w:ascii="Arial" w:hAnsi="Arial"/>
+          <w:b/>
+          <w:bCs/>
+          <w:sz w:val="24"/>
+          <w:szCs w:val="24"/>
+        </w:rPr>
+      </w:pPr>
+      <w:r>
+        <w:rPr>
+          <w:b/>
+          <w:bCs/>
+          <w:sz w:val="24"/>
+          <w:szCs w:val="24"/>
+        </w:rPr>
+      </w:r>
+    </w:p>
+    <w:p xmlns:wp14="http://schemas.microsoft.com/office/word/2010/wordml" wp14:textId="77777777">
+      <w:pPr>
+        <w:pStyle w:val="Normal"/>
+        <w:keepNext w:val="1"/>
+        <w:keepLines w:val="1"/>
+        <w:widowControl w:val="0"/>
+        <w:numPr>
+          <w:ilvl w:val="0"/>
+          <w:numId w:val="1"/>
+        </w:numPr>
+        <w:suppressLineNumbers w:val="0"/>
+        <w:tabs>
+          <w:tab w:val="clear" w:leader="none" w:pos="720"/>
+          <w:tab w:val="left" w:leader="none" w:pos="168"/>
+          <w:tab w:val="left" w:leader="none" w:pos="288"/>
+        </w:tabs>
+        <w:bidi w:val="0"/>
+        <w:spacing w:before="261" w:beforeAutospacing="off" w:after="114" w:afterAutospacing="off" w:line="240" w:lineRule="auto"/>
+        <w:ind w:left="360" w:right="0" w:hanging="360"/>
+        <w:jc w:val="left"/>
+        <w:rPr>
+          <w:b w:val="1"/>
+          <w:bCs w:val="1"/>
+          <w:sz w:val="24"/>
+          <w:szCs w:val="24"/>
+        </w:rPr>
+      </w:pPr>
+      <w:r>
+        <w:rPr>
+          <w:b w:val="1"/>
+          <w:bCs w:val="1"/>
+          <w:sz w:val="24"/>
+          <w:szCs w:val="24"/>
+        </w:rPr>
+        <w:t>VALOR TOTAL DO PLANO</w:t>
+      </w:r>
+    </w:p>
+    <w:p xmlns:wp14="http://schemas.microsoft.com/office/word/2010/wordml" wp14:textId="77777777">
+      <w:pPr>
+        <w:pStyle w:val="Normal"/>
+        <w:keepNext w:val="1"/>
+        <w:keepLines w:val="1"/>
+        <w:widowControl w:val="0"/>
         <w:tabs>
           <w:tab w:val="clear" w:pos="720"/>
-          <w:tab w:val="left" w:pos="168" w:leader="none"/>
-          <w:tab w:val="left" w:pos="288" w:leader="none"/>
+          <w:tab w:val="left" w:leader="none" w:pos="168"/>
+          <w:tab w:val="left" w:leader="none" w:pos="288"/>
         </w:tabs>
-        <w:spacing w:lineRule="auto" w:line="240" w:before="261" w:after="114"/>
-        <w:ind w:hanging="0" w:start="0" w:end="0"/>
+        <w:spacing w:before="261" w:after="114" w:line="240" w:lineRule="auto"/>
+        <w:ind w:start="0" w:end="0" w:hanging="0"/>
+        <w:rPr>
+          <w:rFonts w:ascii="Arial" w:hAnsi="Arial"/>
+          <w:b w:val="1"/>
+          <w:bCs w:val="1"/>
+          <w:sz w:val="12"/>
+          <w:szCs w:val="12"/>
+        </w:rPr>
+      </w:pPr>
+    </w:p>
+    <w:p xmlns:wp14="http://schemas.microsoft.com/office/word/2010/wordml" wp14:textId="77777777">
+      <w:pPr>
+        <w:pStyle w:val="Normal"/>
+        <w:keepNext w:val="1"/>
+        <w:keepLines w:val="1"/>
+        <w:widowControl w:val="0"/>
+        <w:suppressLineNumbers w:val="0"/>
+        <w:bidi w:val="0"/>
+        <w:spacing w:before="90" w:beforeAutospacing="off" w:after="0" w:afterAutospacing="off" w:line="240" w:lineRule="auto"/>
+        <w:ind w:start="0" w:end="0"/>
+        <w:rPr>
+          <w:rFonts w:ascii="Arial" w:hAnsi="Arial"/>
+        </w:rPr>
+      </w:pPr>
+      <w:r>
+        <w:rPr>
+          <w:b w:val="0"/>
+          <w:bCs w:val="0"/>
+          <w:sz w:val="20"/>
+          <w:szCs w:val="20"/>
+        </w:rPr>
+        <w:t>{{valor_do_plano}}</w:t>
+      </w:r>
+    </w:p>
+    <w:p xmlns:wp14="http://schemas.microsoft.com/office/word/2010/wordml" wp14:textId="77777777">
+      <w:pPr>
+        <w:pStyle w:val="Normal"/>
+        <w:widowControl w:val="false"/>
+        <w:suppressLineNumbers w:val="0"/>
+        <w:bidi w:val="0"/>
+        <w:spacing w:before="90" w:beforeAutospacing="0" w:after="0" w:afterAutospacing="0" w:line="240" w:lineRule="auto"/>
+        <w:ind w:start="0" w:end="0"/>
+        <w:jc w:val="start"/>
+        <w:rPr>
+          <w:rFonts w:ascii="Arial" w:hAnsi="Arial"/>
+          <w:b w:val="false"/>
+          <w:bCs w:val="false"/>
+          <w:sz w:val="20"/>
+          <w:szCs w:val="20"/>
+        </w:rPr>
+      </w:pPr>
+      <w:r>
+        <w:rPr>
+          <w:b w:val="false"/>
+          <w:bCs w:val="false"/>
+          <w:sz w:val="20"/>
+          <w:szCs w:val="20"/>
+        </w:rPr>
+      </w:r>
+    </w:p>
+    <w:p xmlns:wp14="http://schemas.microsoft.com/office/word/2010/wordml" wp14:textId="1BF0C200">
+      <w:pPr>
+        <w:pStyle w:val="Normal"/>
+        <w:keepNext w:val="1"/>
+        <w:keepLines w:val="1"/>
+        <w:widowControl w:val="0"/>
+        <w:numPr>
+          <w:ilvl w:val="0"/>
+          <w:numId w:val="1"/>
+        </w:numPr>
+        <w:suppressLineNumbers w:val="0"/>
+        <w:tabs>
+          <w:tab w:val="clear" w:leader="none" w:pos="720"/>
+          <w:tab w:val="left" w:leader="none" w:pos="168"/>
+          <w:tab w:val="left" w:leader="none" w:pos="288"/>
+        </w:tabs>
+        <w:bidi w:val="0"/>
+        <w:spacing w:before="261" w:beforeAutospacing="off" w:after="114" w:afterAutospacing="off" w:line="240" w:lineRule="auto"/>
+        <w:ind w:left="360" w:right="0" w:hanging="360"/>
+        <w:jc w:val="left"/>
+        <w:rPr>
+          <w:b w:val="1"/>
+          <w:bCs w:val="1"/>
+          <w:sz w:val="24"/>
+          <w:szCs w:val="24"/>
+        </w:rPr>
+      </w:pPr>
+      <w:r>
+        <w:rPr>
+          <w:b w:val="1"/>
+          <w:bCs w:val="1"/>
+          <w:sz w:val="24"/>
+          <w:szCs w:val="24"/>
+        </w:rPr>
+        <w:t>RECURSOS NECESSÁRIOS</w:t>
+      </w:r>
+    </w:p>
+    <w:p xmlns:wp14="http://schemas.microsoft.com/office/word/2010/wordml" wp14:textId="77777777">
+      <w:pPr>
+        <w:pStyle w:val="Normal"/>
+        <w:keepNext w:val="1"/>
+        <w:keepLines w:val="1"/>
+        <w:widowControl w:val="0"/>
+        <w:suppressLineNumbers w:val="0"/>
+        <w:suppressAutoHyphens w:val="true"/>
+        <w:bidi w:val="0"/>
+        <w:spacing w:before="147" w:beforeAutospacing="off" w:after="0" w:afterAutospacing="off" w:line="240" w:lineRule="auto"/>
+        <w:ind w:left="270" w:start="0" w:end="0" w:hanging="0"/>
+        <w:rPr>
+          <w:rFonts w:ascii="Arial" w:hAnsi="Arial"/>
+        </w:rPr>
+      </w:pPr>
+      <w:r>
+        <w:rPr>
+          <w:b w:val="0"/>
+          <w:bCs w:val="0"/>
+          <w:sz w:val="20"/>
+          <w:szCs w:val="20"/>
+        </w:rPr>
+        <w:t>{{recursos_necessarios}}</w:t>
+      </w:r>
+    </w:p>
+    <w:p xmlns:wp14="http://schemas.microsoft.com/office/word/2010/wordml" wp14:textId="77777777">
+      <w:pPr>
+        <w:pStyle w:val="Normal"/>
+        <w:widowControl w:val="false"/>
+        <w:numPr>
+          <w:ilvl w:val="0"/>
+          <w:numId w:val="0"/>
+        </w:numPr>
+        <w:spacing w:before="147" w:after="0" w:line="240" w:lineRule="auto"/>
+        <w:ind w:start="0" w:end="0" w:hanging="0"/>
         <w:rPr>
           <w:rFonts w:ascii="Arial" w:hAnsi="Arial"/>
           <w:b/>
           <w:bCs/>
+          <w:sz w:val="24"/>
+          <w:szCs w:val="24"/>
+        </w:rPr>
+      </w:pPr>
+      <w:r>
+        <w:rPr>
+          <w:b/>
+          <w:bCs/>
+          <w:sz w:val="24"/>
+          <w:szCs w:val="24"/>
+        </w:rPr>
+      </w:r>
+    </w:p>
+    <w:p xmlns:wp14="http://schemas.microsoft.com/office/word/2010/wordml" wp14:textId="77777777">
+      <w:pPr>
+        <w:pStyle w:val="Normal"/>
+        <w:keepNext w:val="1"/>
+        <w:keepLines w:val="1"/>
+        <w:widowControl w:val="0"/>
+        <w:numPr>
+          <w:ilvl w:val="0"/>
+          <w:numId w:val="1"/>
+        </w:numPr>
+        <w:suppressLineNumbers w:val="0"/>
+        <w:tabs>
+          <w:tab w:val="clear" w:leader="none" w:pos="720"/>
+          <w:tab w:val="left" w:leader="none" w:pos="168"/>
+          <w:tab w:val="left" w:leader="none" w:pos="288"/>
+        </w:tabs>
+        <w:bidi w:val="0"/>
+        <w:spacing w:before="261" w:beforeAutospacing="off" w:after="114" w:afterAutospacing="off" w:line="240" w:lineRule="auto"/>
+        <w:ind w:left="360" w:right="0" w:hanging="360"/>
+        <w:jc w:val="left"/>
+        <w:rPr>
+          <w:b w:val="1"/>
+          <w:bCs w:val="1"/>
+          <w:sz w:val="24"/>
+          <w:szCs w:val="24"/>
+        </w:rPr>
+      </w:pPr>
+      <w:r>
+        <w:rPr>
+          <w:b w:val="1"/>
+          <w:bCs w:val="1"/>
+          <w:sz w:val="24"/>
+          <w:szCs w:val="24"/>
+        </w:rPr>
+        <w:t>COORDENADOR DO EVENTO</w:t>
+      </w:r>
+    </w:p>
+    <w:p xmlns:wp14="http://schemas.microsoft.com/office/word/2010/wordml" wp14:textId="77777777">
+      <w:pPr>
+        <w:pStyle w:val="Normal"/>
+        <w:keepNext w:val="1"/>
+        <w:keepLines w:val="1"/>
+        <w:widowControl w:val="0"/>
+        <w:tabs>
+          <w:tab w:val="clear" w:pos="720"/>
+          <w:tab w:val="left" w:leader="none" w:pos="168"/>
+          <w:tab w:val="left" w:leader="none" w:pos="288"/>
+        </w:tabs>
+        <w:spacing w:before="261" w:after="114" w:line="240" w:lineRule="auto"/>
+        <w:ind w:start="0" w:end="0" w:hanging="0"/>
+        <w:rPr>
+          <w:rFonts w:ascii="Arial" w:hAnsi="Arial"/>
+          <w:b w:val="1"/>
+          <w:bCs w:val="1"/>
           <w:sz w:val="12"/>
           <w:szCs w:val="12"/>
         </w:rPr>
       </w:pPr>
-      <w:r>
-        <w:rPr>
+    </w:p>
+    <w:p xmlns:wp14="http://schemas.microsoft.com/office/word/2010/wordml" wp14:textId="77777777">
+      <w:pPr>
+        <w:pStyle w:val="Normal"/>
+        <w:keepNext w:val="1"/>
+        <w:keepLines w:val="1"/>
+        <w:widowControl w:val="0"/>
+        <w:suppressLineNumbers w:val="0"/>
+        <w:bidi w:val="0"/>
+        <w:spacing w:before="90" w:beforeAutospacing="off" w:after="0" w:afterAutospacing="off" w:line="240" w:lineRule="auto"/>
+        <w:ind w:start="0" w:end="0"/>
+        <w:rPr>
+          <w:rFonts w:ascii="Arial" w:hAnsi="Arial"/>
+        </w:rPr>
+      </w:pPr>
+      <w:r>
+        <w:rPr>
+          <w:b w:val="0"/>
+          <w:bCs w:val="0"/>
+          <w:sz w:val="20"/>
+          <w:szCs w:val="20"/>
+        </w:rPr>
+        <w:t>{{coordenacao}}</w:t>
+      </w:r>
+    </w:p>
+    <w:p xmlns:wp14="http://schemas.microsoft.com/office/word/2010/wordml" wp14:textId="77777777">
+      <w:pPr>
+        <w:pStyle w:val="Normal"/>
+        <w:widowControl w:val="false"/>
+        <w:numPr>
+          <w:ilvl w:val="0"/>
+          <w:numId w:val="0"/>
+        </w:numPr>
+        <w:spacing w:before="147" w:after="0" w:line="240" w:lineRule="auto"/>
+        <w:ind w:start="0" w:end="0" w:hanging="0"/>
+        <w:rPr>
+          <w:rFonts w:ascii="Arial" w:hAnsi="Arial"/>
           <w:b/>
           <w:bCs/>
+          <w:sz w:val="24"/>
+          <w:szCs w:val="24"/>
+        </w:rPr>
+      </w:pPr>
+      <w:r>
+        <w:rPr>
+          <w:b/>
+          <w:bCs/>
+          <w:sz w:val="24"/>
+          <w:szCs w:val="24"/>
+        </w:rPr>
+      </w:r>
+    </w:p>
+    <w:p xmlns:wp14="http://schemas.microsoft.com/office/word/2010/wordml" wp14:textId="77777777">
+      <w:pPr>
+        <w:pStyle w:val="Normal"/>
+        <w:keepNext w:val="1"/>
+        <w:keepLines w:val="1"/>
+        <w:widowControl w:val="0"/>
+        <w:numPr>
+          <w:ilvl w:val="0"/>
+          <w:numId w:val="1"/>
+        </w:numPr>
+        <w:suppressLineNumbers w:val="0"/>
+        <w:tabs>
+          <w:tab w:val="clear" w:leader="none" w:pos="720"/>
+          <w:tab w:val="left" w:leader="none" w:pos="168"/>
+          <w:tab w:val="left" w:leader="none" w:pos="288"/>
+        </w:tabs>
+        <w:bidi w:val="0"/>
+        <w:spacing w:before="261" w:beforeAutospacing="off" w:after="114" w:afterAutospacing="off" w:line="240" w:lineRule="auto"/>
+        <w:ind w:left="360" w:right="0" w:hanging="360"/>
+        <w:jc w:val="left"/>
+        <w:rPr>
+          <w:b w:val="1"/>
+          <w:bCs w:val="1"/>
+          <w:sz w:val="24"/>
+          <w:szCs w:val="24"/>
+        </w:rPr>
+      </w:pPr>
+      <w:r>
+        <w:rPr>
+          <w:b w:val="1"/>
+          <w:bCs w:val="1"/>
+          <w:sz w:val="24"/>
+          <w:szCs w:val="24"/>
+        </w:rPr>
+        <w:t>CONSIDERAÇÕES FINAIS</w:t>
+      </w:r>
+    </w:p>
+    <w:p xmlns:wp14="http://schemas.microsoft.com/office/word/2010/wordml" wp14:textId="77777777">
+      <w:pPr>
+        <w:pStyle w:val="Normal"/>
+        <w:keepNext w:val="1"/>
+        <w:keepLines w:val="1"/>
+        <w:widowControl w:val="0"/>
+        <w:tabs>
+          <w:tab w:val="clear" w:pos="720"/>
+          <w:tab w:val="left" w:leader="none" w:pos="168"/>
+          <w:tab w:val="left" w:leader="none" w:pos="288"/>
+        </w:tabs>
+        <w:spacing w:before="261" w:after="114" w:line="240" w:lineRule="auto"/>
+        <w:ind w:start="0" w:end="0" w:hanging="0"/>
+        <w:rPr>
+          <w:rFonts w:ascii="Arial" w:hAnsi="Arial"/>
+          <w:b w:val="1"/>
+          <w:bCs w:val="1"/>
           <w:sz w:val="12"/>
           <w:szCs w:val="12"/>
         </w:rPr>
-      </w:r>
-    </w:p>
-    <w:p>
+      </w:pPr>
+    </w:p>
+    <w:p xmlns:wp14="http://schemas.microsoft.com/office/word/2010/wordml" wp14:textId="77777777">
+      <w:pPr>
+        <w:pStyle w:val="Normal"/>
+        <w:keepNext w:val="1"/>
+        <w:keepLines w:val="1"/>
+        <w:widowControl w:val="0"/>
+        <w:suppressLineNumbers w:val="0"/>
+        <w:bidi w:val="0"/>
+        <w:spacing w:before="90" w:beforeAutospacing="off" w:after="0" w:afterAutospacing="off" w:line="240" w:lineRule="auto"/>
+        <w:ind w:start="0" w:end="0"/>
+        <w:rPr>
+          <w:rFonts w:ascii="Arial" w:hAnsi="Arial"/>
+        </w:rPr>
+      </w:pPr>
+      <w:r>
+        <w:rPr>
+          <w:b w:val="0"/>
+          <w:bCs w:val="0"/>
+          <w:sz w:val="20"/>
+          <w:szCs w:val="20"/>
+        </w:rPr>
+        <w:t>{{consideracao_final}}</w:t>
+      </w:r>
+    </w:p>
+    <w:p xmlns:wp14="http://schemas.microsoft.com/office/word/2010/wordml" wp14:textId="77777777">
+      <w:pPr>
+        <w:pStyle w:val="Normal"/>
+        <w:keepNext w:val="true"/>
+        <w:keepLines/>
+        <w:widowControl w:val="false"/>
+        <w:spacing w:before="147" w:after="0" w:line="240" w:lineRule="auto"/>
+        <w:ind w:start="720" w:end="-4"/>
+        <w:jc w:val="both"/>
+        <w:rPr>
+          <w:rFonts w:ascii="Arial" w:hAnsi="Arial"/>
+          <w:b/>
+          <w:bCs/>
+          <w:color w:val="000009"/>
+          <w:sz w:val="24"/>
+          <w:szCs w:val="24"/>
+        </w:rPr>
+      </w:pPr>
+      <w:r>
+        <w:rPr>
+          <w:b/>
+          <w:bCs/>
+          <w:color w:val="000009"/>
+          <w:sz w:val="24"/>
+          <w:szCs w:val="24"/>
+        </w:rPr>
+      </w:r>
+    </w:p>
+    <w:p xmlns:wp14="http://schemas.microsoft.com/office/word/2010/wordml" wp14:textId="77777777">
+      <w:pPr>
+        <w:pStyle w:val="Normal"/>
+        <w:keepNext w:val="true"/>
+        <w:keepLines/>
+        <w:widowControl w:val="false"/>
+        <w:spacing w:before="147" w:after="0" w:line="240" w:lineRule="auto"/>
+        <w:ind w:start="720" w:end="-4"/>
+        <w:jc w:val="both"/>
+        <w:rPr>
+          <w:rFonts w:ascii="Arial" w:hAnsi="Arial"/>
+          <w:b/>
+          <w:bCs/>
+          <w:color w:val="000009"/>
+          <w:sz w:val="24"/>
+          <w:szCs w:val="24"/>
+        </w:rPr>
+      </w:pPr>
+      <w:r>
+        <w:rPr>
+          <w:b/>
+          <w:bCs/>
+          <w:color w:val="000009"/>
+          <w:sz w:val="24"/>
+          <w:szCs w:val="24"/>
+        </w:rPr>
+      </w:r>
+    </w:p>
+    <w:p xmlns:wp14="http://schemas.microsoft.com/office/word/2010/wordml" wp14:textId="77777777">
+      <w:pPr>
+        <w:pStyle w:val="Normal"/>
+        <w:keepNext w:val="true"/>
+        <w:keepLines/>
+        <w:widowControl w:val="false"/>
+        <w:spacing w:line="240" w:lineRule="auto"/>
+        <w:ind w:end="19"/>
+        <w:jc w:val="center"/>
+        <w:rPr>
+          <w:rFonts w:ascii="Arial" w:hAnsi="Arial"/>
+        </w:rPr>
+      </w:pPr>
+      <w:r>
+        <w:rPr/>
+        <w:t>{{sede}}, {{data_extenso}}</w:t>
+      </w:r>
+    </w:p>
+    <w:p xmlns:wp14="http://schemas.microsoft.com/office/word/2010/wordml" wp14:textId="77777777">
       <w:pPr>
         <w:pStyle w:val="Normal"/>
         <w:keepNext w:val="true"/>
@@ -382,208 +1152,26 @@
         <w:widowControl w:val="false"/>
         <w:suppressAutoHyphens w:val="true"/>
         <w:bidi w:val="0"/>
-        <w:spacing w:lineRule="auto" w:line="240" w:before="147" w:after="0"/>
-        <w:ind w:hanging="0" w:start="0" w:end="0"/>
-        <w:jc w:val="start"/>
-        <w:rPr>
-          <w:rFonts w:ascii="Arial" w:hAnsi="Arial"/>
-        </w:rPr>
-      </w:pPr>
-      <w:r>
-        <w:rPr>
-          <w:b w:val="false"/>
-          <w:bCs w:val="false"/>
-          <w:sz w:val="20"/>
-          <w:szCs w:val="20"/>
-        </w:rPr>
-        <w:t>{{metas}}</w:t>
-      </w:r>
-    </w:p>
-    <w:p>
-      <w:pPr>
-        <w:pStyle w:val="Normal"/>
-        <w:widowControl w:val="false"/>
-        <w:numPr>
-          <w:ilvl w:val="0"/>
-          <w:numId w:val="0"/>
-        </w:numPr>
-        <w:spacing w:lineRule="auto" w:line="240" w:before="147" w:after="0"/>
-        <w:ind w:hanging="0" w:start="0" w:end="0"/>
-        <w:rPr>
-          <w:rFonts w:ascii="Arial" w:hAnsi="Arial"/>
-          <w:b/>
-          <w:bCs/>
-          <w:sz w:val="24"/>
-          <w:szCs w:val="24"/>
-        </w:rPr>
-      </w:pPr>
-      <w:r>
-        <w:rPr>
-          <w:b/>
-          <w:bCs/>
-          <w:sz w:val="24"/>
-          <w:szCs w:val="24"/>
-        </w:rPr>
-      </w:r>
-    </w:p>
-    <w:p>
+        <w:spacing w:before="0" w:after="0" w:line="360" w:lineRule="auto"/>
+        <w:ind w:start="0" w:end="0" w:hanging="0"/>
+        <w:jc w:val="center"/>
+        <w:rPr>
+          <w:rFonts w:ascii="Arial" w:hAnsi="Arial"/>
+        </w:rPr>
+      </w:pPr>
+      <w:r>
+        <w:rPr/>
+      </w:r>
+    </w:p>
+    <w:p xmlns:wp14="http://schemas.microsoft.com/office/word/2010/wordml" wp14:textId="77777777">
       <w:pPr>
         <w:pStyle w:val="Normal"/>
         <w:keepNext w:val="true"/>
         <w:keepLines/>
         <w:widowControl w:val="false"/>
-        <w:numPr>
-          <w:ilvl w:val="0"/>
-          <w:numId w:val="1"/>
-        </w:numPr>
-        <w:tabs>
-          <w:tab w:val="clear" w:pos="720"/>
-          <w:tab w:val="left" w:pos="168" w:leader="none"/>
-          <w:tab w:val="left" w:pos="288" w:leader="none"/>
-        </w:tabs>
-        <w:spacing w:lineRule="auto" w:line="240" w:before="261" w:after="114"/>
-        <w:ind w:hanging="0" w:start="0" w:end="0"/>
-        <w:rPr>
-          <w:rFonts w:ascii="Arial" w:hAnsi="Arial"/>
-          <w:b/>
-          <w:bCs/>
-          <w:sz w:val="24"/>
-          <w:szCs w:val="24"/>
-        </w:rPr>
-      </w:pPr>
-      <w:r>
-        <w:rPr>
-          <w:b/>
-          <w:bCs/>
-          <w:sz w:val="24"/>
-          <w:szCs w:val="24"/>
-        </w:rPr>
-        <w:t>ATIVIDADES A SEREM DESENVOLVIDAS</w:t>
-      </w:r>
-    </w:p>
-    <w:p>
-      <w:pPr>
-        <w:pStyle w:val="Normal"/>
-        <w:widowControl w:val="false"/>
-        <w:numPr>
-          <w:ilvl w:val="0"/>
-          <w:numId w:val="0"/>
-        </w:numPr>
-        <w:tabs>
-          <w:tab w:val="clear" w:pos="720"/>
-          <w:tab w:val="left" w:pos="168" w:leader="none"/>
-          <w:tab w:val="left" w:pos="288" w:leader="none"/>
-        </w:tabs>
-        <w:spacing w:lineRule="auto" w:line="240" w:before="261" w:after="114"/>
-        <w:ind w:hanging="0" w:start="0" w:end="0"/>
-        <w:rPr>
-          <w:rFonts w:ascii="Arial" w:hAnsi="Arial"/>
-          <w:b/>
-          <w:bCs/>
-          <w:sz w:val="12"/>
-          <w:szCs w:val="12"/>
-        </w:rPr>
-      </w:pPr>
-      <w:r>
-        <w:rPr>
-          <w:b/>
-          <w:bCs/>
-          <w:sz w:val="12"/>
-          <w:szCs w:val="12"/>
-        </w:rPr>
-      </w:r>
-    </w:p>
-    <w:p>
-      <w:pPr>
-        <w:pStyle w:val="Normal"/>
-        <w:keepNext w:val="true"/>
-        <w:keepLines/>
-        <w:widowControl w:val="false"/>
-        <w:suppressAutoHyphens w:val="true"/>
-        <w:bidi w:val="0"/>
-        <w:spacing w:lineRule="auto" w:line="240" w:before="147" w:after="0"/>
-        <w:ind w:hanging="0" w:start="0" w:end="0"/>
-        <w:jc w:val="start"/>
-        <w:rPr>
-          <w:rFonts w:ascii="Arial" w:hAnsi="Arial"/>
-        </w:rPr>
-      </w:pPr>
-      <w:r>
-        <w:rPr>
-          <w:b w:val="false"/>
-          <w:bCs w:val="false"/>
-          <w:sz w:val="20"/>
-          <w:szCs w:val="20"/>
-        </w:rPr>
-        <w:t>{{atividades}}</w:t>
-      </w:r>
-    </w:p>
-    <w:p>
-      <w:pPr>
-        <w:pStyle w:val="Normal"/>
-        <w:widowControl w:val="false"/>
-        <w:spacing w:lineRule="auto" w:line="240" w:before="147" w:after="0"/>
-        <w:ind w:hanging="0" w:start="0" w:end="0"/>
-        <w:rPr>
-          <w:rFonts w:ascii="Arial" w:hAnsi="Arial"/>
-          <w:b/>
-          <w:bCs/>
-          <w:sz w:val="24"/>
-          <w:szCs w:val="24"/>
-        </w:rPr>
-      </w:pPr>
-      <w:r>
-        <w:rPr>
-          <w:b/>
-          <w:bCs/>
-          <w:sz w:val="24"/>
-          <w:szCs w:val="24"/>
-        </w:rPr>
-      </w:r>
-    </w:p>
-    <w:p>
-      <w:pPr>
-        <w:pStyle w:val="Normal"/>
-        <w:keepNext w:val="true"/>
-        <w:keepLines/>
-        <w:widowControl w:val="false"/>
-        <w:numPr>
-          <w:ilvl w:val="0"/>
-          <w:numId w:val="1"/>
-        </w:numPr>
-        <w:tabs>
-          <w:tab w:val="clear" w:pos="720"/>
-          <w:tab w:val="left" w:pos="168" w:leader="none"/>
-          <w:tab w:val="left" w:pos="288" w:leader="none"/>
-        </w:tabs>
-        <w:spacing w:lineRule="auto" w:line="240" w:before="261" w:after="114"/>
-        <w:ind w:hanging="0" w:start="0" w:end="0"/>
-        <w:rPr>
-          <w:rFonts w:ascii="Arial" w:hAnsi="Arial"/>
-          <w:b/>
-          <w:bCs/>
-          <w:sz w:val="24"/>
-          <w:szCs w:val="24"/>
-        </w:rPr>
-      </w:pPr>
-      <w:r>
-        <w:rPr>
-          <w:b/>
-          <w:bCs/>
-          <w:sz w:val="24"/>
-          <w:szCs w:val="24"/>
-        </w:rPr>
-        <w:t>ATUAÇÃO</w:t>
-      </w:r>
-    </w:p>
-    <w:p>
-      <w:pPr>
-        <w:pStyle w:val="Normal"/>
-        <w:keepNext w:val="true"/>
-        <w:keepLines/>
-        <w:widowControl w:val="false"/>
-        <w:spacing w:lineRule="auto" w:line="240" w:before="147" w:after="0"/>
-        <w:ind w:hanging="0" w:start="720" w:end="0"/>
+        <w:spacing w:line="360" w:lineRule="auto"/>
+        <w:ind w:end="19"/>
+        <w:jc w:val="center"/>
         <w:rPr>
           <w:rFonts w:ascii="Arial" w:hAnsi="Arial"/>
         </w:rPr>
@@ -595,26 +1183,18 @@
           <w:sz w:val="20"/>
           <w:szCs w:val="20"/>
         </w:rPr>
-        <w:t>Datas:</w:t>
-      </w:r>
-      <w:r>
-        <w:rPr>
-          <w:b w:val="false"/>
-          <w:bCs w:val="false"/>
-          <w:sz w:val="20"/>
-          <w:szCs w:val="20"/>
-        </w:rPr>
-        <w:t xml:space="preserve"> {{data_evento}}; </w:t>
-      </w:r>
-    </w:p>
-    <w:p>
+        <w:t>{{nome_chefia}}</w:t>
+      </w:r>
+    </w:p>
+    <w:p xmlns:wp14="http://schemas.microsoft.com/office/word/2010/wordml" wp14:textId="77777777">
       <w:pPr>
         <w:pStyle w:val="Normal"/>
         <w:keepNext w:val="true"/>
         <w:keepLines/>
         <w:widowControl w:val="false"/>
-        <w:spacing w:lineRule="auto" w:line="240" w:before="147" w:after="0"/>
-        <w:ind w:hanging="0" w:start="720" w:end="0"/>
+        <w:spacing w:line="360" w:lineRule="auto"/>
+        <w:ind w:end="19"/>
+        <w:jc w:val="center"/>
         <w:rPr>
           <w:rFonts w:ascii="Arial" w:hAnsi="Arial"/>
         </w:rPr>
@@ -626,722 +1206,14 @@
           <w:sz w:val="20"/>
           <w:szCs w:val="20"/>
         </w:rPr>
-        <w:t>Local:</w:t>
-      </w:r>
-      <w:r>
-        <w:rPr>
-          <w:b w:val="false"/>
-          <w:bCs w:val="false"/>
-          <w:sz w:val="20"/>
-          <w:szCs w:val="20"/>
-        </w:rPr>
-        <w:t xml:space="preserve"> {{destinos}}; </w:t>
-      </w:r>
-    </w:p>
-    <w:p>
-      <w:pPr>
-        <w:pStyle w:val="Normal"/>
-        <w:keepNext w:val="true"/>
-        <w:keepLines/>
+        <w:t>{{cargo_chefia}}</w:t>
+      </w:r>
+    </w:p>
+    <w:p xmlns:wp14="http://schemas.microsoft.com/office/word/2010/wordml" wp14:textId="77777777">
+      <w:pPr>
+        <w:pStyle w:val="Normal"/>
         <w:widowControl w:val="false"/>
-        <w:spacing w:lineRule="auto" w:line="240" w:before="147" w:after="0"/>
-        <w:ind w:hanging="0" w:start="720" w:end="0"/>
-        <w:rPr>
-          <w:rFonts w:ascii="Arial" w:hAnsi="Arial"/>
-        </w:rPr>
-      </w:pPr>
-      <w:r>
-        <w:rPr>
-          <w:b/>
-          <w:bCs/>
-          <w:sz w:val="20"/>
-          <w:szCs w:val="20"/>
-        </w:rPr>
-        <w:t>Horário de atendimento:</w:t>
-      </w:r>
-      <w:r>
-        <w:rPr>
-          <w:b w:val="false"/>
-          <w:bCs w:val="false"/>
-          <w:sz w:val="20"/>
-          <w:szCs w:val="20"/>
-        </w:rPr>
-        <w:t xml:space="preserve"> {{horario_de_atendimento}};</w:t>
-      </w:r>
-    </w:p>
-    <w:p>
-      <w:pPr>
-        <w:pStyle w:val="Normal"/>
-        <w:keepNext w:val="true"/>
-        <w:keepLines/>
-        <w:widowControl w:val="false"/>
-        <w:spacing w:lineRule="auto" w:line="240" w:before="147" w:after="0"/>
-        <w:ind w:hanging="0" w:start="720" w:end="0"/>
-        <w:rPr>
-          <w:rFonts w:ascii="Arial" w:hAnsi="Arial"/>
-        </w:rPr>
-      </w:pPr>
-      <w:r>
-        <w:rPr>
-          <w:b/>
-          <w:bCs/>
-          <w:sz w:val="20"/>
-          <w:szCs w:val="20"/>
-        </w:rPr>
-        <w:t>Efetivo total:</w:t>
-      </w:r>
-      <w:r>
-        <w:rPr>
-          <w:b w:val="false"/>
-          <w:bCs w:val="false"/>
-          <w:sz w:val="20"/>
-          <w:szCs w:val="20"/>
-        </w:rPr>
-        <w:t xml:space="preserve"> {{efetivos}}; </w:t>
-      </w:r>
-    </w:p>
-    <w:p>
-      <w:pPr>
-        <w:pStyle w:val="Normal"/>
-        <w:keepNext w:val="true"/>
-        <w:keepLines/>
-        <w:widowControl w:val="false"/>
-        <w:spacing w:lineRule="auto" w:line="240" w:before="147" w:after="0"/>
-        <w:ind w:hanging="0" w:start="720"/>
-        <w:rPr>
-          <w:rFonts w:ascii="Arial" w:hAnsi="Arial"/>
-        </w:rPr>
-      </w:pPr>
-      <w:r>
-        <w:rPr>
-          <w:b w:val="false"/>
-          <w:bCs w:val="false"/>
-          <w:sz w:val="20"/>
-          <w:szCs w:val="20"/>
-        </w:rPr>
-        <w:t>{{unidade_movel}}</w:t>
-      </w:r>
-    </w:p>
-    <w:p>
-      <w:pPr>
-        <w:pStyle w:val="Normal"/>
-        <w:widowControl w:val="false"/>
-        <w:numPr>
-          <w:ilvl w:val="0"/>
-          <w:numId w:val="0"/>
-        </w:numPr>
-        <w:spacing w:lineRule="auto" w:line="240" w:before="147" w:after="0"/>
-        <w:ind w:hanging="0" w:start="0" w:end="0"/>
-        <w:rPr>
-          <w:rFonts w:ascii="Arial" w:hAnsi="Arial"/>
-          <w:b/>
-          <w:bCs/>
-          <w:sz w:val="24"/>
-          <w:szCs w:val="24"/>
-        </w:rPr>
-      </w:pPr>
-      <w:r>
-        <w:rPr>
-          <w:b/>
-          <w:bCs/>
-          <w:sz w:val="24"/>
-          <w:szCs w:val="24"/>
-        </w:rPr>
-      </w:r>
-    </w:p>
-    <w:p>
-      <w:pPr>
-        <w:pStyle w:val="Normal"/>
-        <w:keepNext w:val="true"/>
-        <w:keepLines/>
-        <w:widowControl w:val="false"/>
-        <w:numPr>
-          <w:ilvl w:val="0"/>
-          <w:numId w:val="1"/>
-        </w:numPr>
-        <w:tabs>
-          <w:tab w:val="clear" w:pos="720"/>
-          <w:tab w:val="left" w:pos="168" w:leader="none"/>
-          <w:tab w:val="left" w:pos="288" w:leader="none"/>
-        </w:tabs>
-        <w:spacing w:lineRule="auto" w:line="240" w:before="261" w:after="114"/>
-        <w:ind w:hanging="0" w:start="0" w:end="0"/>
-        <w:rPr>
-          <w:rFonts w:ascii="Arial" w:hAnsi="Arial"/>
-          <w:b/>
-          <w:bCs/>
-          <w:sz w:val="24"/>
-          <w:szCs w:val="24"/>
-        </w:rPr>
-      </w:pPr>
-      <w:r>
-        <w:rPr>
-          <w:b/>
-          <w:bCs/>
-          <w:sz w:val="24"/>
-          <w:szCs w:val="24"/>
-        </w:rPr>
-        <w:t>VALOR TOTAL DO PLANO</w:t>
-      </w:r>
-    </w:p>
-    <w:p>
-      <w:pPr>
-        <w:pStyle w:val="Normal"/>
-        <w:widowControl w:val="false"/>
-        <w:numPr>
-          <w:ilvl w:val="0"/>
-          <w:numId w:val="0"/>
-        </w:numPr>
-        <w:tabs>
-          <w:tab w:val="clear" w:pos="720"/>
-          <w:tab w:val="left" w:pos="168" w:leader="none"/>
-          <w:tab w:val="left" w:pos="288" w:leader="none"/>
-        </w:tabs>
-        <w:spacing w:lineRule="auto" w:line="240" w:before="261" w:after="114"/>
-        <w:ind w:hanging="0" w:start="0" w:end="0"/>
-        <w:rPr>
-          <w:rFonts w:ascii="Arial" w:hAnsi="Arial"/>
-          <w:b/>
-          <w:bCs/>
-          <w:sz w:val="12"/>
-          <w:szCs w:val="12"/>
-        </w:rPr>
-      </w:pPr>
-      <w:r>
-        <w:rPr>
-          <w:b/>
-          <w:bCs/>
-          <w:sz w:val="12"/>
-          <w:szCs w:val="12"/>
-        </w:rPr>
-      </w:r>
-    </w:p>
-    <w:p>
-      <w:pPr>
-        <w:pStyle w:val="Normal"/>
-        <w:keepNext w:val="true"/>
-        <w:keepLines/>
-        <w:widowControl w:val="false"/>
-        <w:suppressLineNumbers w:val="0"/>
-        <w:bidi w:val="0"/>
-        <w:spacing w:lineRule="auto" w:line="240" w:beforeAutospacing="0" w:before="90" w:afterAutospacing="0" w:after="0"/>
-        <w:ind w:start="0" w:end="0"/>
-        <w:jc w:val="start"/>
-        <w:rPr>
-          <w:rFonts w:ascii="Arial" w:hAnsi="Arial"/>
-        </w:rPr>
-      </w:pPr>
-      <w:r>
-        <w:rPr>
-          <w:b w:val="false"/>
-          <w:bCs w:val="false"/>
-          <w:sz w:val="20"/>
-          <w:szCs w:val="20"/>
-        </w:rPr>
-        <w:t>{{valor_do_plano}}</w:t>
-      </w:r>
-    </w:p>
-    <w:p>
-      <w:pPr>
-        <w:pStyle w:val="Normal"/>
-        <w:widowControl w:val="false"/>
-        <w:suppressLineNumbers w:val="0"/>
-        <w:bidi w:val="0"/>
-        <w:spacing w:lineRule="auto" w:line="240" w:beforeAutospacing="0" w:before="90" w:afterAutospacing="0" w:after="0"/>
-        <w:ind w:start="0" w:end="0"/>
-        <w:jc w:val="start"/>
-        <w:rPr>
-          <w:rFonts w:ascii="Arial" w:hAnsi="Arial"/>
-          <w:b w:val="false"/>
-          <w:bCs w:val="false"/>
-          <w:sz w:val="20"/>
-          <w:szCs w:val="20"/>
-        </w:rPr>
-      </w:pPr>
-      <w:r>
-        <w:rPr>
-          <w:b w:val="false"/>
-          <w:bCs w:val="false"/>
-          <w:sz w:val="20"/>
-          <w:szCs w:val="20"/>
-        </w:rPr>
-      </w:r>
-    </w:p>
-    <w:p>
-      <w:pPr>
-        <w:pStyle w:val="Normal"/>
-        <w:keepNext w:val="true"/>
-        <w:keepLines/>
-        <w:widowControl w:val="false"/>
-        <w:numPr>
-          <w:ilvl w:val="0"/>
-          <w:numId w:val="1"/>
-        </w:numPr>
-        <w:tabs>
-          <w:tab w:val="clear" w:pos="720"/>
-          <w:tab w:val="left" w:pos="168" w:leader="none"/>
-          <w:tab w:val="left" w:pos="288" w:leader="none"/>
-        </w:tabs>
-        <w:spacing w:lineRule="auto" w:line="240" w:before="261" w:after="114"/>
-        <w:ind w:hanging="0" w:start="0" w:end="0"/>
-        <w:rPr>
-          <w:rFonts w:ascii="Arial" w:hAnsi="Arial"/>
-          <w:b/>
-          <w:bCs/>
-          <w:sz w:val="24"/>
-          <w:szCs w:val="24"/>
-        </w:rPr>
-      </w:pPr>
-      <w:r>
-        <w:rPr>
-          <w:b/>
-          <w:bCs/>
-          <w:sz w:val="24"/>
-          <w:szCs w:val="24"/>
-        </w:rPr>
-        <w:t>RECURSOS NECESSÁRIOS</w:t>
-      </w:r>
-    </w:p>
-    <w:p>
-      <w:pPr>
-        <w:pStyle w:val="Normal"/>
-        <w:widowControl w:val="false"/>
-        <w:numPr>
-          <w:ilvl w:val="0"/>
-          <w:numId w:val="0"/>
-        </w:numPr>
-        <w:tabs>
-          <w:tab w:val="clear" w:pos="720"/>
-          <w:tab w:val="left" w:pos="168" w:leader="none"/>
-          <w:tab w:val="left" w:pos="288" w:leader="none"/>
-        </w:tabs>
-        <w:spacing w:lineRule="auto" w:line="240" w:before="261" w:after="114"/>
-        <w:ind w:hanging="0" w:start="0" w:end="0"/>
-        <w:rPr>
-          <w:rFonts w:ascii="Arial" w:hAnsi="Arial"/>
-          <w:b/>
-          <w:bCs/>
-          <w:sz w:val="12"/>
-          <w:szCs w:val="12"/>
-        </w:rPr>
-      </w:pPr>
-      <w:r>
-        <w:rPr>
-          <w:b/>
-          <w:bCs/>
-          <w:sz w:val="12"/>
-          <w:szCs w:val="12"/>
-        </w:rPr>
-      </w:r>
-    </w:p>
-    <w:p>
-      <w:pPr>
-        <w:pStyle w:val="Normal"/>
-        <w:keepNext w:val="true"/>
-        <w:keepLines/>
-        <w:widowControl w:val="false"/>
-        <w:suppressLineNumbers w:val="0"/>
-        <w:suppressAutoHyphens w:val="true"/>
-        <w:bidi w:val="0"/>
-        <w:spacing w:lineRule="auto" w:line="240" w:beforeAutospacing="0" w:before="147" w:afterAutospacing="0" w:after="0"/>
-        <w:ind w:hanging="0" w:start="0" w:end="0"/>
-        <w:jc w:val="start"/>
-        <w:rPr>
-          <w:rFonts w:ascii="Arial" w:hAnsi="Arial"/>
-        </w:rPr>
-      </w:pPr>
-      <w:r>
-        <w:rPr>
-          <w:b w:val="false"/>
-          <w:bCs w:val="false"/>
-          <w:sz w:val="20"/>
-          <w:szCs w:val="20"/>
-        </w:rPr>
-        <w:t>{{recursos_necessarios}}</w:t>
-      </w:r>
-    </w:p>
-    <w:p>
-      <w:pPr>
-        <w:pStyle w:val="Normal"/>
-        <w:widowControl w:val="false"/>
-        <w:numPr>
-          <w:ilvl w:val="0"/>
-          <w:numId w:val="0"/>
-        </w:numPr>
-        <w:spacing w:lineRule="auto" w:line="240" w:before="147" w:after="0"/>
-        <w:ind w:hanging="0" w:start="0" w:end="0"/>
-        <w:rPr>
-          <w:rFonts w:ascii="Arial" w:hAnsi="Arial"/>
-          <w:b/>
-          <w:bCs/>
-          <w:sz w:val="24"/>
-          <w:szCs w:val="24"/>
-        </w:rPr>
-      </w:pPr>
-      <w:r>
-        <w:rPr>
-          <w:b/>
-          <w:bCs/>
-          <w:sz w:val="24"/>
-          <w:szCs w:val="24"/>
-        </w:rPr>
-      </w:r>
-    </w:p>
-    <w:p>
-      <w:pPr>
-        <w:pStyle w:val="Normal"/>
-        <w:keepNext w:val="true"/>
-        <w:keepLines/>
-        <w:widowControl w:val="false"/>
-        <w:numPr>
-          <w:ilvl w:val="0"/>
-          <w:numId w:val="1"/>
-        </w:numPr>
-        <w:tabs>
-          <w:tab w:val="clear" w:pos="720"/>
-          <w:tab w:val="left" w:pos="168" w:leader="none"/>
-          <w:tab w:val="left" w:pos="288" w:leader="none"/>
-        </w:tabs>
-        <w:spacing w:lineRule="auto" w:line="240" w:before="261" w:after="114"/>
-        <w:ind w:hanging="0" w:start="0" w:end="0"/>
-        <w:rPr>
-          <w:rFonts w:ascii="Arial" w:hAnsi="Arial"/>
-          <w:b/>
-          <w:bCs/>
-          <w:sz w:val="24"/>
-          <w:szCs w:val="24"/>
-        </w:rPr>
-      </w:pPr>
-      <w:r>
-        <w:rPr>
-          <w:b/>
-          <w:bCs/>
-          <w:sz w:val="24"/>
-          <w:szCs w:val="24"/>
-        </w:rPr>
-        <w:t>COORDENADOR DO EVENTO</w:t>
-      </w:r>
-    </w:p>
-    <w:p>
-      <w:pPr>
-        <w:pStyle w:val="Normal"/>
-        <w:widowControl w:val="false"/>
-        <w:numPr>
-          <w:ilvl w:val="0"/>
-          <w:numId w:val="0"/>
-        </w:numPr>
-        <w:tabs>
-          <w:tab w:val="clear" w:pos="720"/>
-          <w:tab w:val="left" w:pos="168" w:leader="none"/>
-          <w:tab w:val="left" w:pos="288" w:leader="none"/>
-        </w:tabs>
-        <w:spacing w:lineRule="auto" w:line="240" w:before="261" w:after="114"/>
-        <w:ind w:hanging="0" w:start="0" w:end="0"/>
-        <w:rPr>
-          <w:rFonts w:ascii="Arial" w:hAnsi="Arial"/>
-          <w:b/>
-          <w:bCs/>
-          <w:sz w:val="12"/>
-          <w:szCs w:val="12"/>
-        </w:rPr>
-      </w:pPr>
-      <w:r>
-        <w:rPr>
-          <w:b/>
-          <w:bCs/>
-          <w:sz w:val="12"/>
-          <w:szCs w:val="12"/>
-        </w:rPr>
-      </w:r>
-    </w:p>
-    <w:p>
-      <w:pPr>
-        <w:pStyle w:val="Normal"/>
-        <w:keepNext w:val="true"/>
-        <w:keepLines/>
-        <w:widowControl w:val="false"/>
-        <w:suppressLineNumbers w:val="0"/>
-        <w:bidi w:val="0"/>
-        <w:spacing w:lineRule="auto" w:line="240" w:beforeAutospacing="0" w:before="90" w:afterAutospacing="0" w:after="0"/>
-        <w:ind w:start="0" w:end="0"/>
-        <w:jc w:val="start"/>
-        <w:rPr>
-          <w:rFonts w:ascii="Arial" w:hAnsi="Arial"/>
-        </w:rPr>
-      </w:pPr>
-      <w:r>
-        <w:rPr>
-          <w:b w:val="false"/>
-          <w:bCs w:val="false"/>
-          <w:sz w:val="20"/>
-          <w:szCs w:val="20"/>
-        </w:rPr>
-        <w:t>{{coordenacao}}</w:t>
-      </w:r>
-    </w:p>
-    <w:p>
-      <w:pPr>
-        <w:pStyle w:val="Normal"/>
-        <w:widowControl w:val="false"/>
-        <w:numPr>
-          <w:ilvl w:val="0"/>
-          <w:numId w:val="0"/>
-        </w:numPr>
-        <w:spacing w:lineRule="auto" w:line="240" w:before="147" w:after="0"/>
-        <w:ind w:hanging="0" w:start="0" w:end="0"/>
-        <w:rPr>
-          <w:rFonts w:ascii="Arial" w:hAnsi="Arial"/>
-          <w:b/>
-          <w:bCs/>
-          <w:sz w:val="24"/>
-          <w:szCs w:val="24"/>
-        </w:rPr>
-      </w:pPr>
-      <w:r>
-        <w:rPr>
-          <w:b/>
-          <w:bCs/>
-          <w:sz w:val="24"/>
-          <w:szCs w:val="24"/>
-        </w:rPr>
-      </w:r>
-    </w:p>
-    <w:p>
-      <w:pPr>
-        <w:pStyle w:val="Normal"/>
-        <w:keepNext w:val="true"/>
-        <w:keepLines/>
-        <w:widowControl w:val="false"/>
-        <w:numPr>
-          <w:ilvl w:val="0"/>
-          <w:numId w:val="1"/>
-        </w:numPr>
-        <w:tabs>
-          <w:tab w:val="clear" w:pos="720"/>
-          <w:tab w:val="left" w:pos="168" w:leader="none"/>
-          <w:tab w:val="left" w:pos="288" w:leader="none"/>
-        </w:tabs>
-        <w:spacing w:lineRule="auto" w:line="240" w:before="261" w:after="114"/>
-        <w:ind w:hanging="0" w:start="0" w:end="0"/>
-        <w:rPr>
-          <w:rFonts w:ascii="Arial" w:hAnsi="Arial"/>
-          <w:b/>
-          <w:bCs/>
-          <w:sz w:val="24"/>
-          <w:szCs w:val="24"/>
-        </w:rPr>
-      </w:pPr>
-      <w:r>
-        <w:rPr>
-          <w:b/>
-          <w:bCs/>
-          <w:sz w:val="24"/>
-          <w:szCs w:val="24"/>
-        </w:rPr>
-        <w:t>CONSIDERAÇÕES FINAIS</w:t>
-      </w:r>
-    </w:p>
-    <w:p>
-      <w:pPr>
-        <w:pStyle w:val="Normal"/>
-        <w:widowControl w:val="false"/>
-        <w:numPr>
-          <w:ilvl w:val="0"/>
-          <w:numId w:val="0"/>
-        </w:numPr>
-        <w:tabs>
-          <w:tab w:val="clear" w:pos="720"/>
-          <w:tab w:val="left" w:pos="168" w:leader="none"/>
-          <w:tab w:val="left" w:pos="288" w:leader="none"/>
-        </w:tabs>
-        <w:spacing w:lineRule="auto" w:line="240" w:before="261" w:after="114"/>
-        <w:ind w:hanging="0" w:start="0" w:end="0"/>
-        <w:rPr>
-          <w:rFonts w:ascii="Arial" w:hAnsi="Arial"/>
-          <w:b/>
-          <w:bCs/>
-          <w:sz w:val="12"/>
-          <w:szCs w:val="12"/>
-        </w:rPr>
-      </w:pPr>
-      <w:r>
-        <w:rPr>
-          <w:b/>
-          <w:bCs/>
-          <w:sz w:val="12"/>
-          <w:szCs w:val="12"/>
-        </w:rPr>
-      </w:r>
-    </w:p>
-    <w:p>
-      <w:pPr>
-        <w:pStyle w:val="Normal"/>
-        <w:keepNext w:val="true"/>
-        <w:keepLines/>
-        <w:widowControl w:val="false"/>
-        <w:suppressLineNumbers w:val="0"/>
-        <w:bidi w:val="0"/>
-        <w:spacing w:lineRule="auto" w:line="240" w:beforeAutospacing="0" w:before="90" w:afterAutospacing="0" w:after="0"/>
-        <w:ind w:start="0" w:end="0"/>
-        <w:jc w:val="start"/>
-        <w:rPr>
-          <w:rFonts w:ascii="Arial" w:hAnsi="Arial"/>
-        </w:rPr>
-      </w:pPr>
-      <w:r>
-        <w:rPr>
-          <w:b w:val="false"/>
-          <w:bCs w:val="false"/>
-          <w:sz w:val="20"/>
-          <w:szCs w:val="20"/>
-        </w:rPr>
-        <w:t>{{consideracao_final}}</w:t>
-      </w:r>
-    </w:p>
-    <w:p>
-      <w:pPr>
-        <w:pStyle w:val="Normal"/>
-        <w:keepNext w:val="true"/>
-        <w:keepLines/>
-        <w:widowControl w:val="false"/>
-        <w:spacing w:lineRule="auto" w:line="240" w:before="147" w:after="0"/>
-        <w:ind w:start="720" w:end="-4"/>
-        <w:jc w:val="both"/>
-        <w:rPr>
-          <w:rFonts w:ascii="Arial" w:hAnsi="Arial"/>
-          <w:b/>
-          <w:bCs/>
-          <w:color w:val="000009"/>
-          <w:sz w:val="24"/>
-          <w:szCs w:val="24"/>
-        </w:rPr>
-      </w:pPr>
-      <w:r>
-        <w:rPr>
-          <w:b/>
-          <w:bCs/>
-          <w:color w:val="000009"/>
-          <w:sz w:val="24"/>
-          <w:szCs w:val="24"/>
-        </w:rPr>
-      </w:r>
-    </w:p>
-    <w:p>
-      <w:pPr>
-        <w:pStyle w:val="Normal"/>
-        <w:keepNext w:val="true"/>
-        <w:keepLines/>
-        <w:widowControl w:val="false"/>
-        <w:spacing w:lineRule="auto" w:line="240" w:before="147" w:after="0"/>
-        <w:ind w:start="720" w:end="-4"/>
-        <w:jc w:val="both"/>
-        <w:rPr>
-          <w:rFonts w:ascii="Arial" w:hAnsi="Arial"/>
-          <w:b/>
-          <w:bCs/>
-          <w:color w:val="000009"/>
-          <w:sz w:val="24"/>
-          <w:szCs w:val="24"/>
-        </w:rPr>
-      </w:pPr>
-      <w:r>
-        <w:rPr>
-          <w:b/>
-          <w:bCs/>
-          <w:color w:val="000009"/>
-          <w:sz w:val="24"/>
-          <w:szCs w:val="24"/>
-        </w:rPr>
-      </w:r>
-    </w:p>
-    <w:p>
-      <w:pPr>
-        <w:pStyle w:val="Normal"/>
-        <w:keepNext w:val="true"/>
-        <w:keepLines/>
-        <w:widowControl w:val="false"/>
-        <w:spacing w:lineRule="auto" w:line="240"/>
-        <w:ind w:end="19"/>
-        <w:jc w:val="center"/>
-        <w:rPr>
-          <w:rFonts w:ascii="Arial" w:hAnsi="Arial"/>
-        </w:rPr>
-      </w:pPr>
-      <w:r>
-        <w:rPr/>
-        <w:t>{{sede}}, {{data_extenso}}</w:t>
-      </w:r>
-    </w:p>
-    <w:p>
-      <w:pPr>
-        <w:pStyle w:val="Normal"/>
-        <w:keepNext w:val="true"/>
-        <w:keepLines/>
-        <w:widowControl w:val="false"/>
-        <w:suppressAutoHyphens w:val="true"/>
-        <w:bidi w:val="0"/>
-        <w:spacing w:lineRule="auto" w:line="360" w:before="0" w:after="0"/>
-        <w:ind w:hanging="0" w:start="0" w:end="0"/>
-        <w:jc w:val="center"/>
-        <w:rPr>
-          <w:rFonts w:ascii="Arial" w:hAnsi="Arial"/>
-        </w:rPr>
-      </w:pPr>
-      <w:r>
-        <w:rPr/>
-      </w:r>
-    </w:p>
-    <w:p>
-      <w:pPr>
-        <w:pStyle w:val="Normal"/>
-        <w:keepNext w:val="true"/>
-        <w:keepLines/>
-        <w:widowControl w:val="false"/>
-        <w:spacing w:lineRule="auto" w:line="360"/>
-        <w:ind w:end="19"/>
-        <w:jc w:val="center"/>
-        <w:rPr>
-          <w:rFonts w:ascii="Arial" w:hAnsi="Arial"/>
-        </w:rPr>
-      </w:pPr>
-      <w:r>
-        <w:rPr>
-          <w:b/>
-          <w:bCs/>
-          <w:sz w:val="20"/>
-          <w:szCs w:val="20"/>
-        </w:rPr>
-        <w:t>{{nome_chefia}}</w:t>
-      </w:r>
-    </w:p>
-    <w:p>
-      <w:pPr>
-        <w:pStyle w:val="Normal"/>
-        <w:keepNext w:val="true"/>
-        <w:keepLines/>
-        <w:widowControl w:val="false"/>
-        <w:spacing w:lineRule="auto" w:line="360"/>
-        <w:ind w:end="19"/>
-        <w:jc w:val="center"/>
-        <w:rPr>
-          <w:rFonts w:ascii="Arial" w:hAnsi="Arial"/>
-        </w:rPr>
-      </w:pPr>
-      <w:r>
-        <w:rPr>
-          <w:b/>
-          <w:bCs/>
-          <w:sz w:val="20"/>
-          <w:szCs w:val="20"/>
-        </w:rPr>
-        <w:t>{{cargo_chefia}}</w:t>
-      </w:r>
-    </w:p>
-    <w:p>
-      <w:pPr>
-        <w:pStyle w:val="Normal"/>
-        <w:widowControl w:val="false"/>
-        <w:spacing w:lineRule="auto" w:line="240" w:before="147" w:after="0"/>
+        <w:spacing w:before="147" w:after="0" w:line="240" w:lineRule="auto"/>
         <w:ind w:end="-4"/>
         <w:jc w:val="center"/>
         <w:rPr>
@@ -1371,12 +1243,13 @@
       <w:footerReference w:type="default" r:id="rId6"/>
       <w:footerReference w:type="first" r:id="rId7"/>
       <w:type w:val="nextPage"/>
-      <w:pgSz w:w="11906" w:h="16838"/>
-      <w:pgMar w:left="720" w:right="720" w:gutter="0" w:header="720" w:top="777" w:footer="0" w:bottom="720"/>
-      <w:pgNumType w:start="1" w:fmt="decimal"/>
+      <w:pgSz w:w="11906" w:h="16838" w:orient="portrait"/>
+      <w:pgMar w:top="777" w:right="720" w:bottom="720" w:left="720" w:header="720" w:footer="0" w:gutter="0"/>
+      <w:pgNumType w:fmt="decimal" w:start="1"/>
       <w:formProt w:val="false"/>
       <w:textDirection w:val="lrTb"/>
       <w:docGrid w:type="default" w:linePitch="100" w:charSpace="0"/>
+      <w:cols w:num="1"/>
     </w:sectPr>
   </w:body>
 </w:document>
@@ -1384,7 +1257,7 @@
 
 <file path=word/footer1.xml><?xml version="1.0" encoding="utf-8"?>
 <w:ftr xmlns:o="urn:schemas-microsoft-com:office:office" xmlns:r="http://schemas.openxmlformats.org/officeDocument/2006/relationships" xmlns:v="urn:schemas-microsoft-com:vml" xmlns:w="http://schemas.openxmlformats.org/wordprocessingml/2006/main" xmlns:w10="urn:schemas-microsoft-com:office:word" xmlns:wp="http://schemas.openxmlformats.org/drawingml/2006/wordprocessingDrawing" xmlns:pic="http://schemas.openxmlformats.org/drawingml/2006/picture" xmlns:wps="http://schemas.microsoft.com/office/word/2010/wordprocessingShape" xmlns:wpg="http://schemas.microsoft.com/office/word/2010/wordprocessingGroup" xmlns:mc="http://schemas.openxmlformats.org/markup-compatibility/2006" xmlns:wp14="http://schemas.microsoft.com/office/word/2010/wordprocessingDrawing" xmlns:w14="http://schemas.microsoft.com/office/word/2010/wordml" xmlns:w15="http://schemas.microsoft.com/office/word/2012/wordml" mc:Ignorable="w14 wp14 w15">
-  <w:p>
+  <w:p xmlns:wp14="http://schemas.microsoft.com/office/word/2010/wordml" wp14:textId="77777777">
     <w:pPr>
       <w:pStyle w:val="Footer"/>
       <w:rPr/>
@@ -1397,8 +1270,8 @@
 </file>
 
 <file path=word/footer2.xml><?xml version="1.0" encoding="utf-8"?>
-<w:ftr xmlns:o="urn:schemas-microsoft-com:office:office" xmlns:r="http://schemas.openxmlformats.org/officeDocument/2006/relationships" xmlns:v="urn:schemas-microsoft-com:vml" xmlns:w="http://schemas.openxmlformats.org/wordprocessingml/2006/main" xmlns:w10="urn:schemas-microsoft-com:office:word" xmlns:wp="http://schemas.openxmlformats.org/drawingml/2006/wordprocessingDrawing" xmlns:pic="http://schemas.openxmlformats.org/drawingml/2006/picture" xmlns:wps="http://schemas.microsoft.com/office/word/2010/wordprocessingShape" xmlns:wpg="http://schemas.microsoft.com/office/word/2010/wordprocessingGroup" xmlns:mc="http://schemas.openxmlformats.org/markup-compatibility/2006" xmlns:wp14="http://schemas.microsoft.com/office/word/2010/wordprocessingDrawing" xmlns:w14="http://schemas.microsoft.com/office/word/2010/wordml" xmlns:w15="http://schemas.microsoft.com/office/word/2012/wordml" mc:Ignorable="w14 wp14 w15">
-  <w:p>
+<w:ftr xmlns:o="urn:schemas-microsoft-com:office:office" xmlns:r="http://schemas.openxmlformats.org/officeDocument/2006/relationships" xmlns:v="urn:schemas-microsoft-com:vml" xmlns:w="http://schemas.openxmlformats.org/wordprocessingml/2006/main" xmlns:w10="urn:schemas-microsoft-com:office:word" xmlns:wp="http://schemas.openxmlformats.org/drawingml/2006/wordprocessingDrawing" xmlns:pic="http://schemas.openxmlformats.org/drawingml/2006/picture" xmlns:wps="http://schemas.microsoft.com/office/word/2010/wordprocessingShape" xmlns:wpg="http://schemas.microsoft.com/office/word/2010/wordprocessingGroup" xmlns:mc="http://schemas.openxmlformats.org/markup-compatibility/2006" xmlns:wp14="http://schemas.microsoft.com/office/word/2010/wordprocessingDrawing" xmlns:w14="http://schemas.microsoft.com/office/word/2010/wordml" xmlns:w15="http://schemas.microsoft.com/office/word/2012/wordml" xmlns:a="http://schemas.openxmlformats.org/drawingml/2006/main" mc:Ignorable="w14 wp14 w15">
+  <w:p xmlns:wp14="http://schemas.microsoft.com/office/word/2010/wordml" wp14:textId="77777777">
     <w:pPr>
       <w:pStyle w:val="Footer"/>
       <w:jc w:val="end"/>
@@ -1425,10 +1298,10 @@
       <w:fldChar w:fldCharType="end"/>
     </w:r>
   </w:p>
-  <w:p>
+  <w:p xmlns:wp14="http://schemas.microsoft.com/office/word/2010/wordml" wp14:textId="77777777">
     <w:pPr>
       <w:pStyle w:val="Normal"/>
-      <w:spacing w:lineRule="auto" w:line="240"/>
+      <w:spacing w:line="240" w:lineRule="auto"/>
       <w:jc w:val="center"/>
       <w:rPr>
         <w:sz w:val="24"/>
@@ -1438,7 +1311,7 @@
     <w:r>
       <w:rPr/>
       <w:drawing>
-        <wp:inline distT="0" distB="0" distL="0" distR="0">
+        <wp:inline xmlns:wp14="http://schemas.microsoft.com/office/word/2010/wordprocessingDrawing" distT="0" distB="0" distL="0" distR="0" wp14:anchorId="114F7E6F" wp14:editId="7777777">
           <wp:extent cx="722630" cy="214630"/>
           <wp:effectExtent l="0" t="0" r="0" b="0"/>
           <wp:docPr id="3" name="image1.png"/>
@@ -1478,10 +1351,10 @@
       </w:drawing>
     </w:r>
   </w:p>
-  <w:p>
+  <w:p xmlns:wp14="http://schemas.microsoft.com/office/word/2010/wordml" wp14:textId="77777777">
     <w:pPr>
       <w:pStyle w:val="Normal"/>
-      <w:spacing w:lineRule="auto" w:line="240"/>
+      <w:spacing w:line="240" w:lineRule="auto"/>
       <w:jc w:val="center"/>
       <w:rPr>
         <w:sz w:val="16"/>
@@ -1495,11 +1368,11 @@
       </w:rPr>
     </w:r>
   </w:p>
-  <w:p>
+  <w:p xmlns:wp14="http://schemas.microsoft.com/office/word/2010/wordml" wp14:textId="77777777">
     <w:pPr>
       <w:pStyle w:val="Normal"/>
       <w:widowControl w:val="false"/>
-      <w:spacing w:lineRule="auto" w:line="230"/>
+      <w:spacing w:line="230" w:lineRule="auto"/>
       <w:ind w:start="-450" w:end="-360"/>
       <w:jc w:val="center"/>
       <w:rPr>
@@ -1523,11 +1396,11 @@
       <w:t>{{unidade_rodape}}- {{endereco}}  {{telefone}} – {{email}}</w:t>
     </w:r>
   </w:p>
-  <w:p>
+  <w:p xmlns:wp14="http://schemas.microsoft.com/office/word/2010/wordml" wp14:textId="77777777">
     <w:pPr>
       <w:pStyle w:val="Normal"/>
       <w:widowControl w:val="false"/>
-      <w:spacing w:lineRule="auto" w:line="230"/>
+      <w:spacing w:line="230" w:lineRule="auto"/>
       <w:ind w:start="-450" w:end="-360"/>
       <w:jc w:val="center"/>
       <w:rPr>
@@ -1554,8 +1427,8 @@
 </file>
 
 <file path=word/footer3.xml><?xml version="1.0" encoding="utf-8"?>
-<w:ftr xmlns:o="urn:schemas-microsoft-com:office:office" xmlns:r="http://schemas.openxmlformats.org/officeDocument/2006/relationships" xmlns:v="urn:schemas-microsoft-com:vml" xmlns:w="http://schemas.openxmlformats.org/wordprocessingml/2006/main" xmlns:w10="urn:schemas-microsoft-com:office:word" xmlns:wp="http://schemas.openxmlformats.org/drawingml/2006/wordprocessingDrawing" xmlns:pic="http://schemas.openxmlformats.org/drawingml/2006/picture" xmlns:wps="http://schemas.microsoft.com/office/word/2010/wordprocessingShape" xmlns:wpg="http://schemas.microsoft.com/office/word/2010/wordprocessingGroup" xmlns:mc="http://schemas.openxmlformats.org/markup-compatibility/2006" xmlns:wp14="http://schemas.microsoft.com/office/word/2010/wordprocessingDrawing" xmlns:w14="http://schemas.microsoft.com/office/word/2010/wordml" xmlns:w15="http://schemas.microsoft.com/office/word/2012/wordml" mc:Ignorable="w14 wp14 w15">
-  <w:p>
+<w:ftr xmlns:o="urn:schemas-microsoft-com:office:office" xmlns:r="http://schemas.openxmlformats.org/officeDocument/2006/relationships" xmlns:v="urn:schemas-microsoft-com:vml" xmlns:w="http://schemas.openxmlformats.org/wordprocessingml/2006/main" xmlns:w10="urn:schemas-microsoft-com:office:word" xmlns:wp="http://schemas.openxmlformats.org/drawingml/2006/wordprocessingDrawing" xmlns:pic="http://schemas.openxmlformats.org/drawingml/2006/picture" xmlns:wps="http://schemas.microsoft.com/office/word/2010/wordprocessingShape" xmlns:wpg="http://schemas.microsoft.com/office/word/2010/wordprocessingGroup" xmlns:mc="http://schemas.openxmlformats.org/markup-compatibility/2006" xmlns:wp14="http://schemas.microsoft.com/office/word/2010/wordprocessingDrawing" xmlns:w14="http://schemas.microsoft.com/office/word/2010/wordml" xmlns:w15="http://schemas.microsoft.com/office/word/2012/wordml" xmlns:a="http://schemas.openxmlformats.org/drawingml/2006/main" mc:Ignorable="w14 wp14 w15">
+  <w:p xmlns:wp14="http://schemas.microsoft.com/office/word/2010/wordml" wp14:textId="77777777">
     <w:pPr>
       <w:pStyle w:val="Footer"/>
       <w:jc w:val="end"/>
@@ -1582,10 +1455,10 @@
       <w:fldChar w:fldCharType="end"/>
     </w:r>
   </w:p>
-  <w:p>
+  <w:p xmlns:wp14="http://schemas.microsoft.com/office/word/2010/wordml" wp14:textId="77777777">
     <w:pPr>
       <w:pStyle w:val="Normal"/>
-      <w:spacing w:lineRule="auto" w:line="240"/>
+      <w:spacing w:line="240" w:lineRule="auto"/>
       <w:jc w:val="center"/>
       <w:rPr>
         <w:sz w:val="24"/>
@@ -1595,7 +1468,7 @@
     <w:r>
       <w:rPr/>
       <w:drawing>
-        <wp:inline distT="0" distB="0" distL="0" distR="0">
+        <wp:inline xmlns:wp14="http://schemas.microsoft.com/office/word/2010/wordprocessingDrawing" distT="0" distB="0" distL="0" distR="0" wp14:anchorId="359B393B" wp14:editId="7777777">
           <wp:extent cx="722630" cy="214630"/>
           <wp:effectExtent l="0" t="0" r="0" b="0"/>
           <wp:docPr id="4" name="image1.png"/>
@@ -1635,10 +1508,10 @@
       </w:drawing>
     </w:r>
   </w:p>
-  <w:p>
+  <w:p xmlns:wp14="http://schemas.microsoft.com/office/word/2010/wordml" wp14:textId="77777777">
     <w:pPr>
       <w:pStyle w:val="Normal"/>
-      <w:spacing w:lineRule="auto" w:line="240"/>
+      <w:spacing w:line="240" w:lineRule="auto"/>
       <w:jc w:val="center"/>
       <w:rPr>
         <w:sz w:val="16"/>
@@ -1652,11 +1525,11 @@
       </w:rPr>
     </w:r>
   </w:p>
-  <w:p>
+  <w:p xmlns:wp14="http://schemas.microsoft.com/office/word/2010/wordml" wp14:textId="77777777">
     <w:pPr>
       <w:pStyle w:val="Normal"/>
       <w:widowControl w:val="false"/>
-      <w:spacing w:lineRule="auto" w:line="230"/>
+      <w:spacing w:line="230" w:lineRule="auto"/>
       <w:ind w:start="-450" w:end="-360"/>
       <w:jc w:val="center"/>
       <w:rPr>
@@ -1680,11 +1553,11 @@
       <w:t>{{unidade_rodape}}- {{endereco}}  {{telefone}} – {{email}}</w:t>
     </w:r>
   </w:p>
-  <w:p>
+  <w:p xmlns:wp14="http://schemas.microsoft.com/office/word/2010/wordml" wp14:textId="77777777">
     <w:pPr>
       <w:pStyle w:val="Normal"/>
       <w:widowControl w:val="false"/>
-      <w:spacing w:lineRule="auto" w:line="230"/>
+      <w:spacing w:line="230" w:lineRule="auto"/>
       <w:ind w:start="-450" w:end="-360"/>
       <w:jc w:val="center"/>
       <w:rPr>
@@ -1712,7 +1585,7 @@
 
 <file path=word/header1.xml><?xml version="1.0" encoding="utf-8"?>
 <w:hdr xmlns:o="urn:schemas-microsoft-com:office:office" xmlns:r="http://schemas.openxmlformats.org/officeDocument/2006/relationships" xmlns:v="urn:schemas-microsoft-com:vml" xmlns:w="http://schemas.openxmlformats.org/wordprocessingml/2006/main" xmlns:w10="urn:schemas-microsoft-com:office:word" xmlns:wp="http://schemas.openxmlformats.org/drawingml/2006/wordprocessingDrawing" xmlns:pic="http://schemas.openxmlformats.org/drawingml/2006/picture" xmlns:wps="http://schemas.microsoft.com/office/word/2010/wordprocessingShape" xmlns:wpg="http://schemas.microsoft.com/office/word/2010/wordprocessingGroup" xmlns:mc="http://schemas.openxmlformats.org/markup-compatibility/2006" xmlns:wp14="http://schemas.microsoft.com/office/word/2010/wordprocessingDrawing" xmlns:w14="http://schemas.microsoft.com/office/word/2010/wordml" xmlns:w15="http://schemas.microsoft.com/office/word/2012/wordml" mc:Ignorable="w14 wp14 w15">
-  <w:p>
+  <w:p xmlns:wp14="http://schemas.microsoft.com/office/word/2010/wordml" wp14:textId="77777777">
     <w:pPr>
       <w:pStyle w:val="Header"/>
       <w:rPr/>
@@ -1725,12 +1598,12 @@
 </file>
 
 <file path=word/header2.xml><?xml version="1.0" encoding="utf-8"?>
-<w:hdr xmlns:o="urn:schemas-microsoft-com:office:office" xmlns:r="http://schemas.openxmlformats.org/officeDocument/2006/relationships" xmlns:v="urn:schemas-microsoft-com:vml" xmlns:w="http://schemas.openxmlformats.org/wordprocessingml/2006/main" xmlns:w10="urn:schemas-microsoft-com:office:word" xmlns:wp="http://schemas.openxmlformats.org/drawingml/2006/wordprocessingDrawing" xmlns:pic="http://schemas.openxmlformats.org/drawingml/2006/picture" xmlns:wps="http://schemas.microsoft.com/office/word/2010/wordprocessingShape" xmlns:wpg="http://schemas.microsoft.com/office/word/2010/wordprocessingGroup" xmlns:mc="http://schemas.openxmlformats.org/markup-compatibility/2006" xmlns:wp14="http://schemas.microsoft.com/office/word/2010/wordprocessingDrawing" xmlns:w14="http://schemas.microsoft.com/office/word/2010/wordml" xmlns:w15="http://schemas.microsoft.com/office/word/2012/wordml" mc:Ignorable="w14 wp14 w15">
-  <w:p>
+<w:hdr xmlns:o="urn:schemas-microsoft-com:office:office" xmlns:r="http://schemas.openxmlformats.org/officeDocument/2006/relationships" xmlns:v="urn:schemas-microsoft-com:vml" xmlns:w="http://schemas.openxmlformats.org/wordprocessingml/2006/main" xmlns:w10="urn:schemas-microsoft-com:office:word" xmlns:wp="http://schemas.openxmlformats.org/drawingml/2006/wordprocessingDrawing" xmlns:pic="http://schemas.openxmlformats.org/drawingml/2006/picture" xmlns:wps="http://schemas.microsoft.com/office/word/2010/wordprocessingShape" xmlns:wpg="http://schemas.microsoft.com/office/word/2010/wordprocessingGroup" xmlns:mc="http://schemas.openxmlformats.org/markup-compatibility/2006" xmlns:wp14="http://schemas.microsoft.com/office/word/2010/wordprocessingDrawing" xmlns:w14="http://schemas.microsoft.com/office/word/2010/wordml" xmlns:w15="http://schemas.microsoft.com/office/word/2012/wordml" xmlns:a="http://schemas.openxmlformats.org/drawingml/2006/main" mc:Ignorable="w14 wp14 w15">
+  <w:p xmlns:wp14="http://schemas.microsoft.com/office/word/2010/wordml" wp14:textId="77777777">
     <w:pPr>
       <w:pStyle w:val="Normal"/>
       <w:widowControl w:val="false"/>
-      <w:spacing w:lineRule="auto" w:line="360"/>
+      <w:spacing w:line="360" w:lineRule="auto"/>
       <w:ind w:end="0"/>
       <w:jc w:val="center"/>
       <w:rPr>
@@ -1743,7 +1616,7 @@
     <w:r>
       <w:rPr/>
       <w:drawing>
-        <wp:inline distT="0" distB="0" distL="0" distR="0">
+        <wp:inline xmlns:wp14="http://schemas.microsoft.com/office/word/2010/wordprocessingDrawing" distT="0" distB="0" distL="0" distR="0" wp14:anchorId="02159CE8" wp14:editId="7777777">
           <wp:extent cx="895350" cy="1142365"/>
           <wp:effectExtent l="0" t="0" r="0" b="0"/>
           <wp:docPr id="1" name="image2.png"/>
@@ -1783,11 +1656,11 @@
       </w:drawing>
     </w:r>
   </w:p>
-  <w:p>
+  <w:p xmlns:wp14="http://schemas.microsoft.com/office/word/2010/wordml" wp14:textId="77777777">
     <w:pPr>
       <w:pStyle w:val="Normal"/>
       <w:widowControl w:val="false"/>
-      <w:spacing w:lineRule="auto" w:line="240"/>
+      <w:spacing w:line="240" w:lineRule="auto"/>
       <w:ind w:end="4"/>
       <w:jc w:val="center"/>
       <w:rPr>
@@ -1807,11 +1680,11 @@
       <w:t>SECRETARIA DE ESTADO DA SEGURANÇA PÚBLICA</w:t>
     </w:r>
   </w:p>
-  <w:p>
+  <w:p xmlns:wp14="http://schemas.microsoft.com/office/word/2010/wordml" wp14:textId="77777777">
     <w:pPr>
       <w:pStyle w:val="Normal"/>
       <w:widowControl w:val="false"/>
-      <w:spacing w:lineRule="auto" w:line="240"/>
+      <w:spacing w:line="240" w:lineRule="auto"/>
       <w:ind w:end="4"/>
       <w:jc w:val="center"/>
       <w:rPr>
@@ -1831,11 +1704,11 @@
       <w:t>POLÍCIA CIVIL DO PARANÁ</w:t>
     </w:r>
   </w:p>
-  <w:p>
+  <w:p xmlns:wp14="http://schemas.microsoft.com/office/word/2010/wordml" wp14:textId="77777777">
     <w:pPr>
       <w:pStyle w:val="Normal"/>
       <w:widowControl w:val="false"/>
-      <w:spacing w:lineRule="auto" w:line="240"/>
+      <w:spacing w:line="240" w:lineRule="auto"/>
       <w:ind w:end="4"/>
       <w:jc w:val="center"/>
       <w:rPr>
@@ -1855,11 +1728,11 @@
       <w:t>{{divisao}}</w:t>
     </w:r>
   </w:p>
-  <w:p>
+  <w:p xmlns:wp14="http://schemas.microsoft.com/office/word/2010/wordml" wp14:textId="77777777">
     <w:pPr>
       <w:pStyle w:val="Normal"/>
       <w:widowControl w:val="false"/>
-      <w:spacing w:lineRule="auto" w:line="240"/>
+      <w:spacing w:line="240" w:lineRule="auto"/>
       <w:ind w:end="4"/>
       <w:jc w:val="center"/>
       <w:rPr>
@@ -1879,11 +1752,11 @@
       <w:t>{{unidade}}</w:t>
     </w:r>
   </w:p>
-  <w:p>
+  <w:p xmlns:wp14="http://schemas.microsoft.com/office/word/2010/wordml" wp14:textId="77777777">
     <w:pPr>
       <w:pStyle w:val="Normal"/>
       <w:widowControl w:val="false"/>
-      <w:spacing w:lineRule="auto" w:line="240"/>
+      <w:spacing w:line="240" w:lineRule="auto"/>
       <w:ind w:end="4"/>
       <w:jc w:val="center"/>
       <w:rPr>
@@ -1902,11 +1775,11 @@
       </w:rPr>
     </w:r>
   </w:p>
-  <w:p>
+  <w:p xmlns:wp14="http://schemas.microsoft.com/office/word/2010/wordml" wp14:textId="77777777">
     <w:pPr>
       <w:pStyle w:val="Normal"/>
       <w:widowControl w:val="false"/>
-      <w:spacing w:lineRule="auto" w:line="240"/>
+      <w:spacing w:line="240" w:lineRule="auto"/>
       <w:ind w:end="4"/>
       <w:jc w:val="center"/>
       <w:rPr>
@@ -1925,7 +1798,7 @@
       </w:rPr>
     </w:r>
   </w:p>
-  <w:p>
+  <w:p xmlns:wp14="http://schemas.microsoft.com/office/word/2010/wordml" wp14:textId="77777777">
     <w:pPr>
       <w:pStyle w:val="Normal"/>
       <w:rPr/>
@@ -1938,12 +1811,12 @@
 </file>
 
 <file path=word/header3.xml><?xml version="1.0" encoding="utf-8"?>
-<w:hdr xmlns:o="urn:schemas-microsoft-com:office:office" xmlns:r="http://schemas.openxmlformats.org/officeDocument/2006/relationships" xmlns:v="urn:schemas-microsoft-com:vml" xmlns:w="http://schemas.openxmlformats.org/wordprocessingml/2006/main" xmlns:w10="urn:schemas-microsoft-com:office:word" xmlns:wp="http://schemas.openxmlformats.org/drawingml/2006/wordprocessingDrawing" xmlns:pic="http://schemas.openxmlformats.org/drawingml/2006/picture" xmlns:wps="http://schemas.microsoft.com/office/word/2010/wordprocessingShape" xmlns:wpg="http://schemas.microsoft.com/office/word/2010/wordprocessingGroup" xmlns:mc="http://schemas.openxmlformats.org/markup-compatibility/2006" xmlns:wp14="http://schemas.microsoft.com/office/word/2010/wordprocessingDrawing" xmlns:w14="http://schemas.microsoft.com/office/word/2010/wordml" xmlns:w15="http://schemas.microsoft.com/office/word/2012/wordml" mc:Ignorable="w14 wp14 w15">
-  <w:p>
+<w:hdr xmlns:o="urn:schemas-microsoft-com:office:office" xmlns:r="http://schemas.openxmlformats.org/officeDocument/2006/relationships" xmlns:v="urn:schemas-microsoft-com:vml" xmlns:w="http://schemas.openxmlformats.org/wordprocessingml/2006/main" xmlns:w10="urn:schemas-microsoft-com:office:word" xmlns:wp="http://schemas.openxmlformats.org/drawingml/2006/wordprocessingDrawing" xmlns:pic="http://schemas.openxmlformats.org/drawingml/2006/picture" xmlns:wps="http://schemas.microsoft.com/office/word/2010/wordprocessingShape" xmlns:wpg="http://schemas.microsoft.com/office/word/2010/wordprocessingGroup" xmlns:mc="http://schemas.openxmlformats.org/markup-compatibility/2006" xmlns:wp14="http://schemas.microsoft.com/office/word/2010/wordprocessingDrawing" xmlns:w14="http://schemas.microsoft.com/office/word/2010/wordml" xmlns:w15="http://schemas.microsoft.com/office/word/2012/wordml" xmlns:a="http://schemas.openxmlformats.org/drawingml/2006/main" mc:Ignorable="w14 wp14 w15">
+  <w:p xmlns:wp14="http://schemas.microsoft.com/office/word/2010/wordml" wp14:textId="77777777">
     <w:pPr>
       <w:pStyle w:val="Normal"/>
       <w:widowControl w:val="false"/>
-      <w:spacing w:lineRule="auto" w:line="360"/>
+      <w:spacing w:line="360" w:lineRule="auto"/>
       <w:ind w:end="0"/>
       <w:jc w:val="center"/>
       <w:rPr>
@@ -1956,7 +1829,7 @@
     <w:r>
       <w:rPr/>
       <w:drawing>
-        <wp:inline distT="0" distB="0" distL="0" distR="0">
+        <wp:inline xmlns:wp14="http://schemas.microsoft.com/office/word/2010/wordprocessingDrawing" distT="0" distB="0" distL="0" distR="0" wp14:anchorId="1CBEAD49" wp14:editId="7777777">
           <wp:extent cx="895350" cy="1142365"/>
           <wp:effectExtent l="0" t="0" r="0" b="0"/>
           <wp:docPr id="2" name="image2.png"/>
@@ -1996,11 +1869,11 @@
       </w:drawing>
     </w:r>
   </w:p>
-  <w:p>
+  <w:p xmlns:wp14="http://schemas.microsoft.com/office/word/2010/wordml" wp14:textId="77777777">
     <w:pPr>
       <w:pStyle w:val="Normal"/>
       <w:widowControl w:val="false"/>
-      <w:spacing w:lineRule="auto" w:line="240"/>
+      <w:spacing w:line="240" w:lineRule="auto"/>
       <w:ind w:end="4"/>
       <w:jc w:val="center"/>
       <w:rPr>
@@ -2020,11 +1893,11 @@
       <w:t>SECRETARIA DE ESTADO DA SEGURANÇA PÚBLICA</w:t>
     </w:r>
   </w:p>
-  <w:p>
+  <w:p xmlns:wp14="http://schemas.microsoft.com/office/word/2010/wordml" wp14:textId="77777777">
     <w:pPr>
       <w:pStyle w:val="Normal"/>
       <w:widowControl w:val="false"/>
-      <w:spacing w:lineRule="auto" w:line="240"/>
+      <w:spacing w:line="240" w:lineRule="auto"/>
       <w:ind w:end="4"/>
       <w:jc w:val="center"/>
       <w:rPr>
@@ -2044,11 +1917,11 @@
       <w:t>POLÍCIA CIVIL DO PARANÁ</w:t>
     </w:r>
   </w:p>
-  <w:p>
+  <w:p xmlns:wp14="http://schemas.microsoft.com/office/word/2010/wordml" wp14:textId="77777777">
     <w:pPr>
       <w:pStyle w:val="Normal"/>
       <w:widowControl w:val="false"/>
-      <w:spacing w:lineRule="auto" w:line="240"/>
+      <w:spacing w:line="240" w:lineRule="auto"/>
       <w:ind w:end="4"/>
       <w:jc w:val="center"/>
       <w:rPr>
@@ -2068,11 +1941,11 @@
       <w:t>{{divisao}}</w:t>
     </w:r>
   </w:p>
-  <w:p>
+  <w:p xmlns:wp14="http://schemas.microsoft.com/office/word/2010/wordml" wp14:textId="77777777">
     <w:pPr>
       <w:pStyle w:val="Normal"/>
       <w:widowControl w:val="false"/>
-      <w:spacing w:lineRule="auto" w:line="240"/>
+      <w:spacing w:line="240" w:lineRule="auto"/>
       <w:ind w:end="4"/>
       <w:jc w:val="center"/>
       <w:rPr>
@@ -2092,11 +1965,11 @@
       <w:t>{{unidade}}</w:t>
     </w:r>
   </w:p>
-  <w:p>
+  <w:p xmlns:wp14="http://schemas.microsoft.com/office/word/2010/wordml" wp14:textId="77777777">
     <w:pPr>
       <w:pStyle w:val="Normal"/>
       <w:widowControl w:val="false"/>
-      <w:spacing w:lineRule="auto" w:line="240"/>
+      <w:spacing w:line="240" w:lineRule="auto"/>
       <w:ind w:end="4"/>
       <w:jc w:val="center"/>
       <w:rPr>
@@ -2115,11 +1988,11 @@
       </w:rPr>
     </w:r>
   </w:p>
-  <w:p>
+  <w:p xmlns:wp14="http://schemas.microsoft.com/office/word/2010/wordml" wp14:textId="77777777">
     <w:pPr>
       <w:pStyle w:val="Normal"/>
       <w:widowControl w:val="false"/>
-      <w:spacing w:lineRule="auto" w:line="240"/>
+      <w:spacing w:line="240" w:lineRule="auto"/>
       <w:ind w:end="4"/>
       <w:jc w:val="center"/>
       <w:rPr>
@@ -2138,7 +2011,7 @@
       </w:rPr>
     </w:r>
   </w:p>
-  <w:p>
+  <w:p xmlns:wp14="http://schemas.microsoft.com/office/word/2010/wordml" wp14:textId="77777777">
     <w:pPr>
       <w:pStyle w:val="Normal"/>
       <w:rPr/>
@@ -2270,6 +2143,7 @@
       </w:pPr>
       <w:rPr/>
     </w:lvl>
+    <w:nsid w:val="4e517038"/>
   </w:abstractNum>
   <w:abstractNum w:abstractNumId="2">
     <w:lvl w:ilvl="0">
@@ -2389,6 +2263,7 @@
         <w:ind w:start="0" w:hanging="0"/>
       </w:pPr>
     </w:lvl>
+    <w:nsid w:val="4cf07f0a"/>
   </w:abstractNum>
   <w:num w:numId="1">
     <w:abstractNumId w:val="1"/>
@@ -2400,7 +2275,7 @@
 </file>
 
 <file path=word/styles.xml><?xml version="1.0" encoding="utf-8"?>
-<w:styles xmlns:w="http://schemas.openxmlformats.org/wordprocessingml/2006/main" xmlns:w14="http://schemas.microsoft.com/office/word/2010/wordml" xmlns:mc="http://schemas.openxmlformats.org/markup-compatibility/2006" mc:Ignorable="w14">
+<w:styles xmlns:wp14="http://schemas.microsoft.com/office/word/2010/wordprocessingDrawing" xmlns:w="http://schemas.openxmlformats.org/wordprocessingml/2006/main" xmlns:w14="http://schemas.microsoft.com/office/word/2010/wordml" xmlns:mc="http://schemas.openxmlformats.org/markup-compatibility/2006" mc:Ignorable="w14 wp14">
   <w:docDefaults>
     <w:rPrDefault>
       <w:rPr>
@@ -2801,7 +2676,7 @@
       <w:widowControl/>
       <w:suppressAutoHyphens w:val="true"/>
       <w:bidi w:val="0"/>
-      <w:spacing w:lineRule="auto" w:line="276" w:before="0" w:after="0"/>
+      <w:spacing w:before="0" w:after="0" w:line="276" w:lineRule="auto"/>
       <w:jc w:val="start"/>
     </w:pPr>
     <w:rPr>
@@ -2966,7 +2841,7 @@
     <w:name w:val="Body Text"/>
     <w:basedOn w:val="Normal"/>
     <w:pPr>
-      <w:spacing w:lineRule="auto" w:line="276" w:before="0" w:after="140"/>
+      <w:spacing w:before="0" w:after="140" w:line="276" w:lineRule="auto"/>
     </w:pPr>
     <w:rPr/>
   </w:style>
@@ -3087,10 +2962,10 @@
     <w:pPr>
       <w:tabs>
         <w:tab w:val="clear" w:pos="720"/>
-        <w:tab w:val="center" w:pos="4680" w:leader="none"/>
-        <w:tab w:val="right" w:pos="9360" w:leader="none"/>
+        <w:tab w:val="center" w:leader="none" w:pos="4680"/>
+        <w:tab w:val="right" w:leader="none" w:pos="9360"/>
       </w:tabs>
-      <w:spacing w:lineRule="auto" w:line="240" w:before="0" w:after="0"/>
+      <w:spacing w:before="0" w:after="0" w:line="240" w:lineRule="auto"/>
     </w:pPr>
     <w:rPr/>
   </w:style>
@@ -3120,7 +2995,7 @@
     <w:unhideWhenUsed/>
     <w:qFormat/>
   </w:style>
-  <w:style w:type="table" w:default="1" w:styleId="Tabelanormal">
+  <w:style w:type="table" w:styleId="Tabelanormal" w:default="1">
     <w:name w:val="Normal Table"/>
     <w:uiPriority w:val="99"/>
     <w:semiHidden/>
@@ -3134,7 +3009,7 @@
       </w:tblCellMar>
     </w:tblPr>
   </w:style>
-  <w:style w:type="table" w:customStyle="1" w:styleId="TableNormal">
+  <w:style w:type="table" w:styleId="TableNormal" w:customStyle="1">
     <w:name w:val="TableNormal"/>
     <w:tblPr>
       <w:tblCellMar>

</xml_diff>

<commit_message>
feat: Add conditional rendering for multi-event scenarios in plano_trabalho document
</commit_message>
<xml_diff>
--- a/documentos/resources/plano_trabalho.docx
+++ b/documentos/resources/plano_trabalho.docx
@@ -506,6 +506,42 @@
         <w:t>ATUAÇÃO</w:t>
       </w:r>
     </w:p>
+    <w:p>
+      <w:pPr>
+        <w:pStyle w:val="Normal"/>
+      </w:pPr>
+      <w:r>
+        <w:t xml:space="preserve">{%p if is_multi_evento %}</w:t>
+      </w:r>
+    </w:p>
+    <w:p>
+      <w:pPr>
+        <w:pStyle w:val="Normal"/>
+        <w:spacing w:before="147" w:after="0" w:line="240" w:lineRule="auto"/>
+        <w:ind w:left="270" w:start="720" w:end="0" w:hanging="0"/>
+        <w:rPr>
+          <w:rFonts w:ascii="Arial" w:hAnsi="Arial"/>
+          <w:sz w:val="20"/>
+          <w:szCs w:val="20"/>
+        </w:rPr>
+      </w:pPr>
+      <w:r>
+        <w:rPr>
+          <w:rFonts w:ascii="Arial" w:hAnsi="Arial"/>
+          <w:sz w:val="20"/>
+          <w:szCs w:val="20"/>
+        </w:rPr>
+        <w:t xml:space="preserve">{{atuacao}}</w:t>
+      </w:r>
+    </w:p>
+    <w:p>
+      <w:pPr>
+        <w:pStyle w:val="Normal"/>
+      </w:pPr>
+      <w:r>
+        <w:t xml:space="preserve">{%p else %}</w:t>
+      </w:r>
+    </w:p>
     <w:p xmlns:wp14="http://schemas.microsoft.com/office/word/2010/wordml" wp14:textId="77777777">
       <w:pPr>
         <w:pStyle w:val="Normal"/>
@@ -650,6 +686,14 @@
           <w:szCs w:val="20"/>
         </w:rPr>
         <w:t>{{unidade_movel}}</w:t>
+      </w:r>
+    </w:p>
+    <w:p>
+      <w:pPr>
+        <w:pStyle w:val="Normal"/>
+      </w:pPr>
+      <w:r>
+        <w:t xml:space="preserve">{%p endif %}</w:t>
       </w:r>
     </w:p>
     <w:p xmlns:wp14="http://schemas.microsoft.com/office/word/2010/wordml" wp14:textId="77777777">

</xml_diff>

<commit_message>
feat: Implement multi-event support in plano_trabalho document generation and update related templates
</commit_message>
<xml_diff>
--- a/documentos/resources/plano_trabalho.docx
+++ b/documentos/resources/plano_trabalho.docx
@@ -506,42 +506,6 @@
         <w:t>ATUAÇÃO</w:t>
       </w:r>
     </w:p>
-    <w:p>
-      <w:pPr>
-        <w:pStyle w:val="Normal"/>
-      </w:pPr>
-      <w:r>
-        <w:t xml:space="preserve">{%p if is_multi_evento %}</w:t>
-      </w:r>
-    </w:p>
-    <w:p>
-      <w:pPr>
-        <w:pStyle w:val="Normal"/>
-        <w:spacing w:before="147" w:after="0" w:line="240" w:lineRule="auto"/>
-        <w:ind w:left="270" w:start="720" w:end="0" w:hanging="0"/>
-        <w:rPr>
-          <w:rFonts w:ascii="Arial" w:hAnsi="Arial"/>
-          <w:sz w:val="20"/>
-          <w:szCs w:val="20"/>
-        </w:rPr>
-      </w:pPr>
-      <w:r>
-        <w:rPr>
-          <w:rFonts w:ascii="Arial" w:hAnsi="Arial"/>
-          <w:sz w:val="20"/>
-          <w:szCs w:val="20"/>
-        </w:rPr>
-        <w:t xml:space="preserve">{{atuacao}}</w:t>
-      </w:r>
-    </w:p>
-    <w:p>
-      <w:pPr>
-        <w:pStyle w:val="Normal"/>
-      </w:pPr>
-      <w:r>
-        <w:t xml:space="preserve">{%p else %}</w:t>
-      </w:r>
-    </w:p>
     <w:p xmlns:wp14="http://schemas.microsoft.com/office/word/2010/wordml" wp14:textId="77777777">
       <w:pPr>
         <w:pStyle w:val="Normal"/>
@@ -686,14 +650,6 @@
           <w:szCs w:val="20"/>
         </w:rPr>
         <w:t>{{unidade_movel}}</w:t>
-      </w:r>
-    </w:p>
-    <w:p>
-      <w:pPr>
-        <w:pStyle w:val="Normal"/>
-      </w:pPr>
-      <w:r>
-        <w:t xml:space="preserve">{%p endif %}</w:t>
       </w:r>
     </w:p>
     <w:p xmlns:wp14="http://schemas.microsoft.com/office/word/2010/wordml" wp14:textId="77777777">

</xml_diff>